<commit_message>
docs: add complete testing checklist for Pokolenie comfort AS
- adapt from reference DOC-PROJ-CL-001 structure
- add 9 test coverage elements (COV-PK-XXX)
</commit_message>
<xml_diff>
--- a/taks/lw_03/check_list_testing.docx
+++ b/taks/lw_03/check_list_testing.docx
@@ -7,269 +7,280 @@
         <w:pStyle w:val="Title"/>
       </w:pPr>
       <w:r>
-        <w:t>ЧЕК-ЛИСТ ТЕСТИРОВАНИЯ АС "ПОКОЛЕНИЕ КОМФОРТА"</w:t>
+        <w:t>СПЕЦИФИКАЦИЯ ЧЕК-ЛИСТОВ ТЕСТИРОВАНИЯ АС «ПОКОЛЕНИЕ КОМФОРТА»</w:t>
       </w:r>
     </w:p>
+    <w:p/>
     <w:p>
       <w:pPr>
         <w:pStyle w:val="Heading1"/>
       </w:pPr>
       <w:r>
-        <w:t>1. Цель и область проверки</w:t>
+        <w:t>1. Спецификация документа</w:t>
       </w:r>
     </w:p>
     <w:p>
       <w:r>
-        <w:t>Цель проверки: Проверка корректности функционирования АС «Поколение комфорта».</w:t>
+        <w:t>Наименование документа: Спецификация чек-листов тестирования АС «Поколение комфорта»</w:t>
       </w:r>
     </w:p>
     <w:p>
       <w:r>
-        <w:t>Объект проверки:</w:t>
-      </w:r>
-      <w:r>
-        <w:br/>
-        <w:t>Функции автоматизированной системы управления деятельностью компании «Поколение комфорта».</w:t>
+        <w:t>Идентификатор документа: DOC-PK-CL-001</w:t>
       </w:r>
     </w:p>
     <w:p>
       <w:r>
-        <w:t>Область проверки включает:</w:t>
-      </w:r>
-      <w:r>
-        <w:br/>
-        <w:t>• подсистема «Управление продажами и клиентами» (CRM);</w:t>
-      </w:r>
-      <w:r>
-        <w:br/>
-        <w:t>• подсистема «Управление проектами»;</w:t>
-      </w:r>
-      <w:r>
-        <w:br/>
-        <w:t>• подсистема «Снабжение и склад»;</w:t>
-      </w:r>
-      <w:r>
-        <w:br/>
-        <w:t>• подсистема «Учет рабочего времени и мотивация»;</w:t>
-      </w:r>
-      <w:r>
-        <w:br/>
-        <w:t>• подсистема «Документооборот».</w:t>
+        <w:t>Версия: 1.0</w:t>
       </w:r>
     </w:p>
+    <w:p>
+      <w:r>
+        <w:t>Статус: Проект</w:t>
+      </w:r>
+    </w:p>
+    <w:p>
+      <w:r>
+        <w:t>Дата: 18.04.2026</w:t>
+      </w:r>
+    </w:p>
+    <w:p/>
     <w:p>
       <w:pPr>
         <w:pStyle w:val="Heading1"/>
       </w:pPr>
       <w:r>
-        <w:t>2. Основание для проверки</w:t>
+        <w:t>2. Введение</w:t>
+      </w:r>
+    </w:p>
+    <w:p>
+      <w:pPr>
+        <w:pStyle w:val="Heading2"/>
+      </w:pPr>
+      <w:r>
+        <w:t>2.1 Назначение документа</w:t>
       </w:r>
     </w:p>
     <w:p>
       <w:r>
-        <w:t>Основанием для проведения проверки являются:</w:t>
-      </w:r>
-      <w:r>
-        <w:br/>
-        <w:t>• установленная логика работы АС «Поколение комфорта»;</w:t>
-      </w:r>
-      <w:r>
-        <w:br/>
-        <w:t>• бизнес-процессы компании;</w:t>
-      </w:r>
-      <w:r>
-        <w:br/>
-        <w:t>• правила обработки данных;</w:t>
-      </w:r>
-      <w:r>
-        <w:br/>
-        <w:t>• правила разграничения прав доступа;</w:t>
-      </w:r>
-      <w:r>
-        <w:br/>
-        <w:t>• состав и взаимосвязи сущностей подсистем.</w:t>
+        <w:t>Настоящий документ устанавливает состав, структуру и содержание чек-листов тестирования АС «Поколение комфорта», а также определяет элементы тестового покрытия и связанные с ними контрольные примеры.</w:t>
       </w:r>
     </w:p>
+    <w:p>
+      <w:pPr>
+        <w:pStyle w:val="Heading2"/>
+      </w:pPr>
+      <w:r>
+        <w:t>2.2 Нормативные и проектные ссылки</w:t>
+      </w:r>
+    </w:p>
+    <w:p>
+      <w:r>
+        <w:t>- Техническое задание на АС «Поколение комфорта»;</w:t>
+      </w:r>
+    </w:p>
+    <w:p>
+      <w:r>
+        <w:t>- Функциональные требования к подсистемам АС;</w:t>
+      </w:r>
+    </w:p>
+    <w:p>
+      <w:r>
+        <w:t>- Описание бизнес-процессов компании;</w:t>
+      </w:r>
+    </w:p>
+    <w:p>
+      <w:r>
+        <w:t>- Регламенты разграничения прав доступа;</w:t>
+      </w:r>
+    </w:p>
+    <w:p>
+      <w:r>
+        <w:t>- ГОСТ Р 56921-2016;</w:t>
+      </w:r>
+    </w:p>
+    <w:p>
+      <w:r>
+        <w:t>- ГОСТ 34.602-2020.</w:t>
+      </w:r>
+    </w:p>
+    <w:p>
+      <w:pPr>
+        <w:pStyle w:val="Heading2"/>
+      </w:pPr>
+      <w:r>
+        <w:t>2.3 Термины и сокращения</w:t>
+      </w:r>
+    </w:p>
+    <w:tbl>
+      <w:tblPr>
+        <w:tblStyle w:val="TableGrid"/>
+        <w:tblW w:type="auto" w:w="0"/>
+        <w:tblLook w:firstColumn="1" w:firstRow="1" w:lastColumn="0" w:lastRow="0" w:noHBand="0" w:noVBand="1" w:val="04A0"/>
+      </w:tblPr>
+      <w:tblGrid>
+        <w:gridCol w:w="4320"/>
+        <w:gridCol w:w="4320"/>
+      </w:tblGrid>
+      <w:tr>
+        <w:tc>
+          <w:tcPr>
+            <w:tcW w:type="dxa" w:w="4320"/>
+            <w:shd w:fill="E0E0E0"/>
+          </w:tcPr>
+          <w:p>
+            <w:r>
+              <w:t>АС «Поколение комфорта»</w:t>
+            </w:r>
+          </w:p>
+        </w:tc>
+        <w:tc>
+          <w:tcPr>
+            <w:tcW w:type="dxa" w:w="4320"/>
+          </w:tcPr>
+          <w:p>
+            <w:r>
+              <w:t>Автоматизированная система управления деятельностью компании</w:t>
+            </w:r>
+          </w:p>
+        </w:tc>
+      </w:tr>
+      <w:tr>
+        <w:tc>
+          <w:tcPr>
+            <w:tcW w:type="dxa" w:w="4320"/>
+            <w:shd w:fill="E0E0E0"/>
+          </w:tcPr>
+          <w:p>
+            <w:r>
+              <w:t>Подсистема</w:t>
+            </w:r>
+          </w:p>
+        </w:tc>
+        <w:tc>
+          <w:tcPr>
+            <w:tcW w:type="dxa" w:w="4320"/>
+          </w:tcPr>
+          <w:p>
+            <w:r>
+              <w:t>Функциональная часть АС, обеспечивающая автоматизацию конкретного бизнес-процесса</w:t>
+            </w:r>
+          </w:p>
+        </w:tc>
+      </w:tr>
+      <w:tr>
+        <w:tc>
+          <w:tcPr>
+            <w:tcW w:type="dxa" w:w="4320"/>
+            <w:shd w:fill="E0E0E0"/>
+          </w:tcPr>
+          <w:p>
+            <w:r>
+              <w:t>Элемент тестового покрытия</w:t>
+            </w:r>
+          </w:p>
+        </w:tc>
+        <w:tc>
+          <w:tcPr>
+            <w:tcW w:type="dxa" w:w="4320"/>
+          </w:tcPr>
+          <w:p>
+            <w:r>
+              <w:t>Объект, функция, правило или сценарий, подлежащий проверке</w:t>
+            </w:r>
+          </w:p>
+        </w:tc>
+      </w:tr>
+      <w:tr>
+        <w:tc>
+          <w:tcPr>
+            <w:tcW w:type="dxa" w:w="4320"/>
+            <w:shd w:fill="E0E0E0"/>
+          </w:tcPr>
+          <w:p>
+            <w:r>
+              <w:t>Контрольный пример</w:t>
+            </w:r>
+          </w:p>
+        </w:tc>
+        <w:tc>
+          <w:tcPr>
+            <w:tcW w:type="dxa" w:w="4320"/>
+          </w:tcPr>
+          <w:p>
+            <w:r>
+              <w:t>Отдельная тестовая проверка для подтверждения ожидаемого поведения системы</w:t>
+            </w:r>
+          </w:p>
+        </w:tc>
+      </w:tr>
+      <w:tr>
+        <w:tc>
+          <w:tcPr>
+            <w:tcW w:type="dxa" w:w="4320"/>
+            <w:shd w:fill="E0E0E0"/>
+          </w:tcPr>
+          <w:p>
+            <w:r>
+              <w:t>Предусловие</w:t>
+            </w:r>
+          </w:p>
+        </w:tc>
+        <w:tc>
+          <w:tcPr>
+            <w:tcW w:type="dxa" w:w="4320"/>
+          </w:tcPr>
+          <w:p>
+            <w:r>
+              <w:t>Состояние системы или набор данных, необходимый для выполнения проверки</w:t>
+            </w:r>
+          </w:p>
+        </w:tc>
+      </w:tr>
+      <w:tr>
+        <w:tc>
+          <w:tcPr>
+            <w:tcW w:type="dxa" w:w="4320"/>
+            <w:shd w:fill="E0E0E0"/>
+          </w:tcPr>
+          <w:p>
+            <w:r>
+              <w:t>SLA</w:t>
+            </w:r>
+          </w:p>
+        </w:tc>
+        <w:tc>
+          <w:tcPr>
+            <w:tcW w:type="dxa" w:w="4320"/>
+          </w:tcPr>
+          <w:p>
+            <w:r>
+              <w:t>Service Level Agreement — соглашение об уровне сервиса</w:t>
+            </w:r>
+          </w:p>
+        </w:tc>
+      </w:tr>
+      <w:tr>
+        <w:tc>
+          <w:tcPr>
+            <w:tcW w:type="dxa" w:w="4320"/>
+          </w:tcPr>
+          <w:p/>
+        </w:tc>
+        <w:tc>
+          <w:tcPr>
+            <w:tcW w:type="dxa" w:w="4320"/>
+          </w:tcPr>
+          <w:p/>
+        </w:tc>
+      </w:tr>
+    </w:tbl>
     <w:p>
       <w:pPr>
         <w:pStyle w:val="Heading1"/>
       </w:pPr>
       <w:r>
-        <w:t>3. Условия выполнения</w:t>
-      </w:r>
-    </w:p>
-    <w:p>
-      <w:r>
-        <w:t>Предусловия выполнения проверки:</w:t>
-      </w:r>
-      <w:r>
-        <w:br/>
-        <w:t>• пользователь авторизован в системе;</w:t>
-      </w:r>
-      <w:r>
-        <w:br/>
-        <w:t>• тестовая среда доступна;</w:t>
-      </w:r>
-      <w:r>
-        <w:br/>
-        <w:t>• в системе подготовлены тестовые данные;</w:t>
-      </w:r>
-      <w:r>
-        <w:br/>
-        <w:t>• доступны учетные записи пользователей с различными ролями;</w:t>
-      </w:r>
-      <w:r>
-        <w:br/>
-        <w:t>• доступны сущности, необходимые для выполнения проверок.</w:t>
-      </w:r>
-    </w:p>
-    <w:p>
-      <w:r>
-        <w:t>Минимальный состав тестовых данных:</w:t>
-      </w:r>
-      <w:r>
-        <w:br/>
-        <w:t>• клиент;</w:t>
-      </w:r>
-      <w:r>
-        <w:br/>
-        <w:t>• заявка;</w:t>
-      </w:r>
-      <w:r>
-        <w:br/>
-        <w:t>• проект;</w:t>
-      </w:r>
-      <w:r>
-        <w:br/>
-        <w:t>• этап проекта;</w:t>
-      </w:r>
-      <w:r>
-        <w:br/>
-        <w:t>• задача проекта;</w:t>
-      </w:r>
-      <w:r>
-        <w:br/>
-        <w:t>• смета;</w:t>
-      </w:r>
-      <w:r>
-        <w:br/>
-        <w:t>• поставщик;</w:t>
-      </w:r>
-      <w:r>
-        <w:br/>
-        <w:t>• номенклатура;</w:t>
-      </w:r>
-      <w:r>
-        <w:br/>
-        <w:t>• договор;</w:t>
-      </w:r>
-      <w:r>
-        <w:br/>
-        <w:t>• пользовательские роли.</w:t>
-      </w:r>
-    </w:p>
-    <w:p>
-      <w:r>
-        <w:t>Порядок фиксации результатов:</w:t>
-      </w:r>
-      <w:r>
-        <w:br/>
-        <w:t>• по каждой проверке фиксируется фактический результат;</w:t>
-      </w:r>
-      <w:r>
-        <w:br/>
-        <w:t>• по каждой проверке указывается статус выполнения;</w:t>
-      </w:r>
-      <w:r>
-        <w:br/>
-        <w:t>• при выявлении отклонения вносится примечание;</w:t>
-      </w:r>
-      <w:r>
-        <w:br/>
-        <w:t>• при невозможности выполнения проверки фиксируется соответствующий статус.</w:t>
-      </w:r>
-    </w:p>
-    <w:p>
-      <w:pPr>
-        <w:pStyle w:val="Heading1"/>
-      </w:pPr>
-      <w:r>
-        <w:t>4. Табличная часть проверок</w:t>
-      </w:r>
-    </w:p>
-    <w:p>
-      <w:r>
-        <w:t>Чек-лист 1. Подсистема «Управление пр��дажами и клиентами» (CRM)</w:t>
-      </w:r>
-    </w:p>
-    <w:p>
-      <w:r>
-        <w:t>Чек-лист 2. Подсистема «Управление проектами»</w:t>
-      </w:r>
-    </w:p>
-    <w:p>
-      <w:r>
-        <w:t>Чек-лист 3. Подсистема «Снабжение и склад»</w:t>
-      </w:r>
-    </w:p>
-    <w:p>
-      <w:r>
-        <w:t>Чек-лист 4. Подсистема «Учет рабочего времени и мотивация»</w:t>
-      </w:r>
-    </w:p>
-    <w:p>
-      <w:r>
-        <w:t>Чек-лист 5. Подсистема «Документооборот»</w:t>
-      </w:r>
-    </w:p>
-    <w:p>
-      <w:r>
-        <w:t>Чек-лист 6. Разграничение доступа и интеграция подсистем</w:t>
-      </w:r>
-    </w:p>
-    <w:p>
-      <w:pPr>
-        <w:pStyle w:val="Heading1"/>
-      </w:pPr>
-      <w:r>
-        <w:t>5. Результаты выполнения</w:t>
-      </w:r>
-    </w:p>
-    <w:p>
-      <w:r>
-        <w:t>Итоговые показатели по чек-листу:</w:t>
-      </w:r>
-      <w:r>
-        <w:br/>
-        <w:t>• всего проверок: ___;</w:t>
-      </w:r>
-      <w:r>
-        <w:br/>
-        <w:t>• выполнено: ___;</w:t>
-      </w:r>
-      <w:r>
-        <w:br/>
-        <w:t>• успешно: ___;</w:t>
-      </w:r>
-      <w:r>
-        <w:br/>
-        <w:t>• неуспешно: ___;</w:t>
-      </w:r>
-      <w:r>
-        <w:br/>
-        <w:t>• заблокировано: ___;</w:t>
-      </w:r>
-      <w:r>
-        <w:br/>
-        <w:t>• не применимо: ___.</w:t>
-      </w:r>
-    </w:p>
-    <w:p>
-      <w:pPr>
-        <w:pStyle w:val="Heading1"/>
-      </w:pPr>
-      <w:r>
-        <w:t>Чек-лист 1. Подсистема «Управление продажами и клиентами» (CRM)</w:t>
+        <w:t>3. Элементы тестового покрытия</w:t>
       </w:r>
     </w:p>
     <w:tbl>
@@ -288,40 +299,44 @@
         <w:tc>
           <w:tcPr>
             <w:tcW w:type="dxa" w:w="2160"/>
+            <w:shd w:fill="4472C4"/>
           </w:tcPr>
           <w:p>
             <w:r>
-              <w:t>№</w:t>
+              <w:t>ID</w:t>
             </w:r>
           </w:p>
         </w:tc>
         <w:tc>
           <w:tcPr>
             <w:tcW w:type="dxa" w:w="2160"/>
+            <w:shd w:fill="4472C4"/>
           </w:tcPr>
           <w:p>
             <w:r>
-              <w:t>Наименование проверки</w:t>
+              <w:t>Наименование элемента</w:t>
             </w:r>
           </w:p>
         </w:tc>
         <w:tc>
           <w:tcPr>
             <w:tcW w:type="dxa" w:w="2160"/>
+            <w:shd w:fill="4472C4"/>
           </w:tcPr>
           <w:p>
             <w:r>
-              <w:t>Статус</w:t>
+              <w:t>Описание</w:t>
             </w:r>
           </w:p>
         </w:tc>
         <w:tc>
           <w:tcPr>
             <w:tcW w:type="dxa" w:w="2160"/>
+            <w:shd w:fill="4472C4"/>
           </w:tcPr>
           <w:p>
             <w:r>
-              <w:t>Примечание</w:t>
+              <w:t>Приоритет</w:t>
             </w:r>
           </w:p>
         </w:tc>
@@ -331,21 +346,221 @@
           <w:tcPr>
             <w:tcW w:type="dxa" w:w="2160"/>
           </w:tcPr>
-          <w:p>
-            <w:r>
-              <w:t>1.1</w:t>
-            </w:r>
-          </w:p>
+          <w:p/>
         </w:tc>
         <w:tc>
           <w:tcPr>
             <w:tcW w:type="dxa" w:w="2160"/>
           </w:tcPr>
-          <w:p>
-            <w:r>
-              <w:t>Фиксация входящих обращений с указанием источника и контактных данных</w:t>
-            </w:r>
-          </w:p>
+          <w:p/>
+        </w:tc>
+        <w:tc>
+          <w:tcPr>
+            <w:tcW w:type="dxa" w:w="2160"/>
+          </w:tcPr>
+          <w:p/>
+        </w:tc>
+        <w:tc>
+          <w:tcPr>
+            <w:tcW w:type="dxa" w:w="2160"/>
+          </w:tcPr>
+          <w:p/>
+        </w:tc>
+      </w:tr>
+      <w:tr>
+        <w:tc>
+          <w:tcPr>
+            <w:tcW w:type="dxa" w:w="2160"/>
+          </w:tcPr>
+          <w:p/>
+        </w:tc>
+        <w:tc>
+          <w:tcPr>
+            <w:tcW w:type="dxa" w:w="2160"/>
+          </w:tcPr>
+          <w:p/>
+        </w:tc>
+        <w:tc>
+          <w:tcPr>
+            <w:tcW w:type="dxa" w:w="2160"/>
+          </w:tcPr>
+          <w:p/>
+        </w:tc>
+        <w:tc>
+          <w:tcPr>
+            <w:tcW w:type="dxa" w:w="2160"/>
+          </w:tcPr>
+          <w:p/>
+        </w:tc>
+      </w:tr>
+      <w:tr>
+        <w:tc>
+          <w:tcPr>
+            <w:tcW w:type="dxa" w:w="2160"/>
+          </w:tcPr>
+          <w:p/>
+        </w:tc>
+        <w:tc>
+          <w:tcPr>
+            <w:tcW w:type="dxa" w:w="2160"/>
+          </w:tcPr>
+          <w:p/>
+        </w:tc>
+        <w:tc>
+          <w:tcPr>
+            <w:tcW w:type="dxa" w:w="2160"/>
+          </w:tcPr>
+          <w:p/>
+        </w:tc>
+        <w:tc>
+          <w:tcPr>
+            <w:tcW w:type="dxa" w:w="2160"/>
+          </w:tcPr>
+          <w:p/>
+        </w:tc>
+      </w:tr>
+      <w:tr>
+        <w:tc>
+          <w:tcPr>
+            <w:tcW w:type="dxa" w:w="2160"/>
+          </w:tcPr>
+          <w:p/>
+        </w:tc>
+        <w:tc>
+          <w:tcPr>
+            <w:tcW w:type="dxa" w:w="2160"/>
+          </w:tcPr>
+          <w:p/>
+        </w:tc>
+        <w:tc>
+          <w:tcPr>
+            <w:tcW w:type="dxa" w:w="2160"/>
+          </w:tcPr>
+          <w:p/>
+        </w:tc>
+        <w:tc>
+          <w:tcPr>
+            <w:tcW w:type="dxa" w:w="2160"/>
+          </w:tcPr>
+          <w:p/>
+        </w:tc>
+      </w:tr>
+      <w:tr>
+        <w:tc>
+          <w:tcPr>
+            <w:tcW w:type="dxa" w:w="2160"/>
+          </w:tcPr>
+          <w:p/>
+        </w:tc>
+        <w:tc>
+          <w:tcPr>
+            <w:tcW w:type="dxa" w:w="2160"/>
+          </w:tcPr>
+          <w:p/>
+        </w:tc>
+        <w:tc>
+          <w:tcPr>
+            <w:tcW w:type="dxa" w:w="2160"/>
+          </w:tcPr>
+          <w:p/>
+        </w:tc>
+        <w:tc>
+          <w:tcPr>
+            <w:tcW w:type="dxa" w:w="2160"/>
+          </w:tcPr>
+          <w:p/>
+        </w:tc>
+      </w:tr>
+      <w:tr>
+        <w:tc>
+          <w:tcPr>
+            <w:tcW w:type="dxa" w:w="2160"/>
+          </w:tcPr>
+          <w:p/>
+        </w:tc>
+        <w:tc>
+          <w:tcPr>
+            <w:tcW w:type="dxa" w:w="2160"/>
+          </w:tcPr>
+          <w:p/>
+        </w:tc>
+        <w:tc>
+          <w:tcPr>
+            <w:tcW w:type="dxa" w:w="2160"/>
+          </w:tcPr>
+          <w:p/>
+        </w:tc>
+        <w:tc>
+          <w:tcPr>
+            <w:tcW w:type="dxa" w:w="2160"/>
+          </w:tcPr>
+          <w:p/>
+        </w:tc>
+      </w:tr>
+      <w:tr>
+        <w:tc>
+          <w:tcPr>
+            <w:tcW w:type="dxa" w:w="2160"/>
+          </w:tcPr>
+          <w:p/>
+        </w:tc>
+        <w:tc>
+          <w:tcPr>
+            <w:tcW w:type="dxa" w:w="2160"/>
+          </w:tcPr>
+          <w:p/>
+        </w:tc>
+        <w:tc>
+          <w:tcPr>
+            <w:tcW w:type="dxa" w:w="2160"/>
+          </w:tcPr>
+          <w:p/>
+        </w:tc>
+        <w:tc>
+          <w:tcPr>
+            <w:tcW w:type="dxa" w:w="2160"/>
+          </w:tcPr>
+          <w:p/>
+        </w:tc>
+      </w:tr>
+      <w:tr>
+        <w:tc>
+          <w:tcPr>
+            <w:tcW w:type="dxa" w:w="2160"/>
+          </w:tcPr>
+          <w:p/>
+        </w:tc>
+        <w:tc>
+          <w:tcPr>
+            <w:tcW w:type="dxa" w:w="2160"/>
+          </w:tcPr>
+          <w:p/>
+        </w:tc>
+        <w:tc>
+          <w:tcPr>
+            <w:tcW w:type="dxa" w:w="2160"/>
+          </w:tcPr>
+          <w:p/>
+        </w:tc>
+        <w:tc>
+          <w:tcPr>
+            <w:tcW w:type="dxa" w:w="2160"/>
+          </w:tcPr>
+          <w:p/>
+        </w:tc>
+      </w:tr>
+      <w:tr>
+        <w:tc>
+          <w:tcPr>
+            <w:tcW w:type="dxa" w:w="2160"/>
+          </w:tcPr>
+          <w:p/>
+        </w:tc>
+        <w:tc>
+          <w:tcPr>
+            <w:tcW w:type="dxa" w:w="2160"/>
+          </w:tcPr>
+          <w:p/>
         </w:tc>
         <w:tc>
           <w:tcPr>
@@ -367,7 +582,7 @@
           </w:tcPr>
           <w:p>
             <w:r>
-              <w:t>1.2</w:t>
+              <w:t>COV-PK-001</w:t>
             </w:r>
           </w:p>
         </w:tc>
@@ -377,31 +592,7 @@
           </w:tcPr>
           <w:p>
             <w:r>
-              <w:t>Формирование и хранение опросного листа (ТЗ) по установленной форме</w:t>
-            </w:r>
-          </w:p>
-        </w:tc>
-        <w:tc>
-          <w:tcPr>
-            <w:tcW w:type="dxa" w:w="2160"/>
-          </w:tcPr>
-          <w:p/>
-        </w:tc>
-        <w:tc>
-          <w:tcPr>
-            <w:tcW w:type="dxa" w:w="2160"/>
-          </w:tcPr>
-          <w:p/>
-        </w:tc>
-      </w:tr>
-      <w:tr>
-        <w:tc>
-          <w:tcPr>
-            <w:tcW w:type="dxa" w:w="2160"/>
-          </w:tcPr>
-          <w:p>
-            <w:r>
-              <w:t>1.3</w:t>
+              <w:t>Управление продажами и клиентами</w:t>
             </w:r>
           </w:p>
         </w:tc>
@@ -411,31 +602,7 @@
           </w:tcPr>
           <w:p>
             <w:r>
-              <w:t>Привязка к клиенту плана проекта</w:t>
-            </w:r>
-          </w:p>
-        </w:tc>
-        <w:tc>
-          <w:tcPr>
-            <w:tcW w:type="dxa" w:w="2160"/>
-          </w:tcPr>
-          <w:p/>
-        </w:tc>
-        <w:tc>
-          <w:tcPr>
-            <w:tcW w:type="dxa" w:w="2160"/>
-          </w:tcPr>
-          <w:p/>
-        </w:tc>
-      </w:tr>
-      <w:tr>
-        <w:tc>
-          <w:tcPr>
-            <w:tcW w:type="dxa" w:w="2160"/>
-          </w:tcPr>
-          <w:p>
-            <w:r>
-              <w:t>1.4</w:t>
+              <w:t>Проверка функций CRM: фиксация обращений, статусы сделок</w:t>
             </w:r>
           </w:p>
         </w:tc>
@@ -445,150 +612,7 @@
           </w:tcPr>
           <w:p>
             <w:r>
-              <w:t>Учет статуса сделки</w:t>
-            </w:r>
-          </w:p>
-        </w:tc>
-        <w:tc>
-          <w:tcPr>
-            <w:tcW w:type="dxa" w:w="2160"/>
-          </w:tcPr>
-          <w:p/>
-        </w:tc>
-        <w:tc>
-          <w:tcPr>
-            <w:tcW w:type="dxa" w:w="2160"/>
-          </w:tcPr>
-          <w:p/>
-        </w:tc>
-      </w:tr>
-      <w:tr>
-        <w:tc>
-          <w:tcPr>
-            <w:tcW w:type="dxa" w:w="2160"/>
-          </w:tcPr>
-          <w:p>
-            <w:r>
-              <w:t>1.5</w:t>
-            </w:r>
-          </w:p>
-        </w:tc>
-        <w:tc>
-          <w:tcPr>
-            <w:tcW w:type="dxa" w:w="2160"/>
-          </w:tcPr>
-          <w:p>
-            <w:r>
-              <w:t>Напоминания о встречах и задачах для сотрудников отдела продаж</w:t>
-            </w:r>
-          </w:p>
-        </w:tc>
-        <w:tc>
-          <w:tcPr>
-            <w:tcW w:type="dxa" w:w="2160"/>
-          </w:tcPr>
-          <w:p/>
-        </w:tc>
-        <w:tc>
-          <w:tcPr>
-            <w:tcW w:type="dxa" w:w="2160"/>
-          </w:tcPr>
-          <w:p/>
-        </w:tc>
-      </w:tr>
-      <w:tr>
-        <w:tc>
-          <w:tcPr>
-            <w:tcW w:type="dxa" w:w="2160"/>
-          </w:tcPr>
-          <w:p>
-            <w:r>
-              <w:t>1.6</w:t>
-            </w:r>
-          </w:p>
-        </w:tc>
-        <w:tc>
-          <w:tcPr>
-            <w:tcW w:type="dxa" w:w="2160"/>
-          </w:tcPr>
-          <w:p>
-            <w:r>
-              <w:t>Хранение и редактирование данных клиентов</w:t>
-            </w:r>
-          </w:p>
-        </w:tc>
-        <w:tc>
-          <w:tcPr>
-            <w:tcW w:type="dxa" w:w="2160"/>
-          </w:tcPr>
-          <w:p/>
-        </w:tc>
-        <w:tc>
-          <w:tcPr>
-            <w:tcW w:type="dxa" w:w="2160"/>
-          </w:tcPr>
-          <w:p/>
-        </w:tc>
-      </w:tr>
-    </w:tbl>
-    <w:p>
-      <w:pPr>
-        <w:pStyle w:val="Heading1"/>
-      </w:pPr>
-      <w:r>
-        <w:t>Чек-лист 2. Подсистема «Управление проектами»</w:t>
-      </w:r>
-    </w:p>
-    <w:tbl>
-      <w:tblPr>
-        <w:tblStyle w:val="TableGrid"/>
-        <w:tblW w:type="auto" w:w="0"/>
-        <w:tblLook w:firstColumn="1" w:firstRow="1" w:lastColumn="0" w:lastRow="0" w:noHBand="0" w:noVBand="1" w:val="04A0"/>
-      </w:tblPr>
-      <w:tblGrid>
-        <w:gridCol w:w="2160"/>
-        <w:gridCol w:w="2160"/>
-        <w:gridCol w:w="2160"/>
-        <w:gridCol w:w="2160"/>
-      </w:tblGrid>
-      <w:tr>
-        <w:tc>
-          <w:tcPr>
-            <w:tcW w:type="dxa" w:w="2160"/>
-          </w:tcPr>
-          <w:p>
-            <w:r>
-              <w:t>№</w:t>
-            </w:r>
-          </w:p>
-        </w:tc>
-        <w:tc>
-          <w:tcPr>
-            <w:tcW w:type="dxa" w:w="2160"/>
-          </w:tcPr>
-          <w:p>
-            <w:r>
-              <w:t>Наименование проверки</w:t>
-            </w:r>
-          </w:p>
-        </w:tc>
-        <w:tc>
-          <w:tcPr>
-            <w:tcW w:type="dxa" w:w="2160"/>
-          </w:tcPr>
-          <w:p>
-            <w:r>
-              <w:t>Статус</w:t>
-            </w:r>
-          </w:p>
-        </w:tc>
-        <w:tc>
-          <w:tcPr>
-            <w:tcW w:type="dxa" w:w="2160"/>
-          </w:tcPr>
-          <w:p>
-            <w:r>
-              <w:t>Примечание</w:t>
+              <w:t>Высокий</w:t>
             </w:r>
           </w:p>
         </w:tc>
@@ -600,7 +624,7 @@
           </w:tcPr>
           <w:p>
             <w:r>
-              <w:t>2.1</w:t>
+              <w:t>COV-PK-002</w:t>
             </w:r>
           </w:p>
         </w:tc>
@@ -610,31 +634,7 @@
           </w:tcPr>
           <w:p>
             <w:r>
-              <w:t>Создание карточки проекта на основе опросного листа</w:t>
-            </w:r>
-          </w:p>
-        </w:tc>
-        <w:tc>
-          <w:tcPr>
-            <w:tcW w:type="dxa" w:w="2160"/>
-          </w:tcPr>
-          <w:p/>
-        </w:tc>
-        <w:tc>
-          <w:tcPr>
-            <w:tcW w:type="dxa" w:w="2160"/>
-          </w:tcPr>
-          <w:p/>
-        </w:tc>
-      </w:tr>
-      <w:tr>
-        <w:tc>
-          <w:tcPr>
-            <w:tcW w:type="dxa" w:w="2160"/>
-          </w:tcPr>
-          <w:p>
-            <w:r>
-              <w:t>2.2</w:t>
+              <w:t>Управление проектами</w:t>
             </w:r>
           </w:p>
         </w:tc>
@@ -644,31 +644,7 @@
           </w:tcPr>
           <w:p>
             <w:r>
-              <w:t>Формирование и ведение проектной документации</w:t>
-            </w:r>
-          </w:p>
-        </w:tc>
-        <w:tc>
-          <w:tcPr>
-            <w:tcW w:type="dxa" w:w="2160"/>
-          </w:tcPr>
-          <w:p/>
-        </w:tc>
-        <w:tc>
-          <w:tcPr>
-            <w:tcW w:type="dxa" w:w="2160"/>
-          </w:tcPr>
-          <w:p/>
-        </w:tc>
-      </w:tr>
-      <w:tr>
-        <w:tc>
-          <w:tcPr>
-            <w:tcW w:type="dxa" w:w="2160"/>
-          </w:tcPr>
-          <w:p>
-            <w:r>
-              <w:t>2.3</w:t>
+              <w:t>Проверка создания карточек проектов, ведение документации</w:t>
             </w:r>
           </w:p>
         </w:tc>
@@ -678,286 +654,7 @@
           </w:tcPr>
           <w:p>
             <w:r>
-              <w:t>Прикрепление файлов к карточке проекта</w:t>
-            </w:r>
-          </w:p>
-        </w:tc>
-        <w:tc>
-          <w:tcPr>
-            <w:tcW w:type="dxa" w:w="2160"/>
-          </w:tcPr>
-          <w:p/>
-        </w:tc>
-        <w:tc>
-          <w:tcPr>
-            <w:tcW w:type="dxa" w:w="2160"/>
-          </w:tcPr>
-          <w:p/>
-        </w:tc>
-      </w:tr>
-      <w:tr>
-        <w:tc>
-          <w:tcPr>
-            <w:tcW w:type="dxa" w:w="2160"/>
-          </w:tcPr>
-          <w:p>
-            <w:r>
-              <w:t>2.4</w:t>
-            </w:r>
-          </w:p>
-        </w:tc>
-        <w:tc>
-          <w:tcPr>
-            <w:tcW w:type="dxa" w:w="2160"/>
-          </w:tcPr>
-          <w:p>
-            <w:r>
-              <w:t>Создание задач на закупку</w:t>
-            </w:r>
-          </w:p>
-        </w:tc>
-        <w:tc>
-          <w:tcPr>
-            <w:tcW w:type="dxa" w:w="2160"/>
-          </w:tcPr>
-          <w:p/>
-        </w:tc>
-        <w:tc>
-          <w:tcPr>
-            <w:tcW w:type="dxa" w:w="2160"/>
-          </w:tcPr>
-          <w:p/>
-        </w:tc>
-      </w:tr>
-      <w:tr>
-        <w:tc>
-          <w:tcPr>
-            <w:tcW w:type="dxa" w:w="2160"/>
-          </w:tcPr>
-          <w:p>
-            <w:r>
-              <w:t>2.5</w:t>
-            </w:r>
-          </w:p>
-        </w:tc>
-        <w:tc>
-          <w:tcPr>
-            <w:tcW w:type="dxa" w:w="2160"/>
-          </w:tcPr>
-          <w:p>
-            <w:r>
-              <w:t>Создание плана монтажными бригадами</w:t>
-            </w:r>
-          </w:p>
-        </w:tc>
-        <w:tc>
-          <w:tcPr>
-            <w:tcW w:type="dxa" w:w="2160"/>
-          </w:tcPr>
-          <w:p/>
-        </w:tc>
-        <w:tc>
-          <w:tcPr>
-            <w:tcW w:type="dxa" w:w="2160"/>
-          </w:tcPr>
-          <w:p/>
-        </w:tc>
-      </w:tr>
-      <w:tr>
-        <w:tc>
-          <w:tcPr>
-            <w:tcW w:type="dxa" w:w="2160"/>
-          </w:tcPr>
-          <w:p>
-            <w:r>
-              <w:t>2.6</w:t>
-            </w:r>
-          </w:p>
-        </w:tc>
-        <w:tc>
-          <w:tcPr>
-            <w:tcW w:type="dxa" w:w="2160"/>
-          </w:tcPr>
-          <w:p>
-            <w:r>
-              <w:t>Контроль выполнения задач руководителем</w:t>
-            </w:r>
-          </w:p>
-        </w:tc>
-        <w:tc>
-          <w:tcPr>
-            <w:tcW w:type="dxa" w:w="2160"/>
-          </w:tcPr>
-          <w:p/>
-        </w:tc>
-        <w:tc>
-          <w:tcPr>
-            <w:tcW w:type="dxa" w:w="2160"/>
-          </w:tcPr>
-          <w:p/>
-        </w:tc>
-      </w:tr>
-      <w:tr>
-        <w:tc>
-          <w:tcPr>
-            <w:tcW w:type="dxa" w:w="2160"/>
-          </w:tcPr>
-          <w:p>
-            <w:r>
-              <w:t>2.7</w:t>
-            </w:r>
-          </w:p>
-        </w:tc>
-        <w:tc>
-          <w:tcPr>
-            <w:tcW w:type="dxa" w:w="2160"/>
-          </w:tcPr>
-          <w:p>
-            <w:r>
-              <w:t>Ведение реестра договоров</w:t>
-            </w:r>
-          </w:p>
-        </w:tc>
-        <w:tc>
-          <w:tcPr>
-            <w:tcW w:type="dxa" w:w="2160"/>
-          </w:tcPr>
-          <w:p/>
-        </w:tc>
-        <w:tc>
-          <w:tcPr>
-            <w:tcW w:type="dxa" w:w="2160"/>
-          </w:tcPr>
-          <w:p/>
-        </w:tc>
-      </w:tr>
-      <w:tr>
-        <w:tc>
-          <w:tcPr>
-            <w:tcW w:type="dxa" w:w="2160"/>
-          </w:tcPr>
-          <w:p>
-            <w:r>
-              <w:t>2.8</w:t>
-            </w:r>
-          </w:p>
-        </w:tc>
-        <w:tc>
-          <w:tcPr>
-            <w:tcW w:type="dxa" w:w="2160"/>
-          </w:tcPr>
-          <w:p>
-            <w:r>
-              <w:t>Формирование акта внутренней приемки</w:t>
-            </w:r>
-          </w:p>
-        </w:tc>
-        <w:tc>
-          <w:tcPr>
-            <w:tcW w:type="dxa" w:w="2160"/>
-          </w:tcPr>
-          <w:p/>
-        </w:tc>
-        <w:tc>
-          <w:tcPr>
-            <w:tcW w:type="dxa" w:w="2160"/>
-          </w:tcPr>
-          <w:p/>
-        </w:tc>
-      </w:tr>
-      <w:tr>
-        <w:tc>
-          <w:tcPr>
-            <w:tcW w:type="dxa" w:w="2160"/>
-          </w:tcPr>
-          <w:p>
-            <w:r>
-              <w:t>2.9</w:t>
-            </w:r>
-          </w:p>
-        </w:tc>
-        <w:tc>
-          <w:tcPr>
-            <w:tcW w:type="dxa" w:w="2160"/>
-          </w:tcPr>
-          <w:p>
-            <w:r>
-              <w:t>Учет процесса сдачи заказчику</w:t>
-            </w:r>
-          </w:p>
-        </w:tc>
-        <w:tc>
-          <w:tcPr>
-            <w:tcW w:type="dxa" w:w="2160"/>
-          </w:tcPr>
-          <w:p/>
-        </w:tc>
-        <w:tc>
-          <w:tcPr>
-            <w:tcW w:type="dxa" w:w="2160"/>
-          </w:tcPr>
-          <w:p/>
-        </w:tc>
-      </w:tr>
-    </w:tbl>
-    <w:p>
-      <w:pPr>
-        <w:pStyle w:val="Heading1"/>
-      </w:pPr>
-      <w:r>
-        <w:t>Чек-лист 3. Подсистема «Снабжение и склад»</w:t>
-      </w:r>
-    </w:p>
-    <w:tbl>
-      <w:tblPr>
-        <w:tblStyle w:val="TableGrid"/>
-        <w:tblW w:type="auto" w:w="0"/>
-        <w:tblLook w:firstColumn="1" w:firstRow="1" w:lastColumn="0" w:lastRow="0" w:noHBand="0" w:noVBand="1" w:val="04A0"/>
-      </w:tblPr>
-      <w:tblGrid>
-        <w:gridCol w:w="2160"/>
-        <w:gridCol w:w="2160"/>
-        <w:gridCol w:w="2160"/>
-        <w:gridCol w:w="2160"/>
-      </w:tblGrid>
-      <w:tr>
-        <w:tc>
-          <w:tcPr>
-            <w:tcW w:type="dxa" w:w="2160"/>
-          </w:tcPr>
-          <w:p>
-            <w:r>
-              <w:t>№</w:t>
-            </w:r>
-          </w:p>
-        </w:tc>
-        <w:tc>
-          <w:tcPr>
-            <w:tcW w:type="dxa" w:w="2160"/>
-          </w:tcPr>
-          <w:p>
-            <w:r>
-              <w:t>Наименование проверки</w:t>
-            </w:r>
-          </w:p>
-        </w:tc>
-        <w:tc>
-          <w:tcPr>
-            <w:tcW w:type="dxa" w:w="2160"/>
-          </w:tcPr>
-          <w:p>
-            <w:r>
-              <w:t>Статус</w:t>
-            </w:r>
-          </w:p>
-        </w:tc>
-        <w:tc>
-          <w:tcPr>
-            <w:tcW w:type="dxa" w:w="2160"/>
-          </w:tcPr>
-          <w:p>
-            <w:r>
-              <w:t>Примечание</w:t>
+              <w:t>Высокий</w:t>
             </w:r>
           </w:p>
         </w:tc>
@@ -969,7 +666,7 @@
           </w:tcPr>
           <w:p>
             <w:r>
-              <w:t>3.1</w:t>
+              <w:t>COV-PK-003</w:t>
             </w:r>
           </w:p>
         </w:tc>
@@ -979,31 +676,7 @@
           </w:tcPr>
           <w:p>
             <w:r>
-              <w:t>Ведение справочника поставщиков</w:t>
-            </w:r>
-          </w:p>
-        </w:tc>
-        <w:tc>
-          <w:tcPr>
-            <w:tcW w:type="dxa" w:w="2160"/>
-          </w:tcPr>
-          <w:p/>
-        </w:tc>
-        <w:tc>
-          <w:tcPr>
-            <w:tcW w:type="dxa" w:w="2160"/>
-          </w:tcPr>
-          <w:p/>
-        </w:tc>
-      </w:tr>
-      <w:tr>
-        <w:tc>
-          <w:tcPr>
-            <w:tcW w:type="dxa" w:w="2160"/>
-          </w:tcPr>
-          <w:p>
-            <w:r>
-              <w:t>3.2</w:t>
+              <w:t>Планирование этапов и задач</w:t>
             </w:r>
           </w:p>
         </w:tc>
@@ -1013,31 +686,7 @@
           </w:tcPr>
           <w:p>
             <w:r>
-              <w:t>Ведение номенклатуры с ценами</w:t>
-            </w:r>
-          </w:p>
-        </w:tc>
-        <w:tc>
-          <w:tcPr>
-            <w:tcW w:type="dxa" w:w="2160"/>
-          </w:tcPr>
-          <w:p/>
-        </w:tc>
-        <w:tc>
-          <w:tcPr>
-            <w:tcW w:type="dxa" w:w="2160"/>
-          </w:tcPr>
-          <w:p/>
-        </w:tc>
-      </w:tr>
-      <w:tr>
-        <w:tc>
-          <w:tcPr>
-            <w:tcW w:type="dxa" w:w="2160"/>
-          </w:tcPr>
-          <w:p>
-            <w:r>
-              <w:t>3.3</w:t>
+              <w:t>Проверка создания и редактирования этапов и задач</w:t>
             </w:r>
           </w:p>
         </w:tc>
@@ -1047,252 +696,7 @@
           </w:tcPr>
           <w:p>
             <w:r>
-              <w:t>Создание заявки на закупку на основе сметы</w:t>
-            </w:r>
-          </w:p>
-        </w:tc>
-        <w:tc>
-          <w:tcPr>
-            <w:tcW w:type="dxa" w:w="2160"/>
-          </w:tcPr>
-          <w:p/>
-        </w:tc>
-        <w:tc>
-          <w:tcPr>
-            <w:tcW w:type="dxa" w:w="2160"/>
-          </w:tcPr>
-          <w:p/>
-        </w:tc>
-      </w:tr>
-      <w:tr>
-        <w:tc>
-          <w:tcPr>
-            <w:tcW w:type="dxa" w:w="2160"/>
-          </w:tcPr>
-          <w:p>
-            <w:r>
-              <w:t>3.4</w:t>
-            </w:r>
-          </w:p>
-        </w:tc>
-        <w:tc>
-          <w:tcPr>
-            <w:tcW w:type="dxa" w:w="2160"/>
-          </w:tcPr>
-          <w:p>
-            <w:r>
-              <w:t>Фиксация коммерческих предложений</w:t>
-            </w:r>
-          </w:p>
-        </w:tc>
-        <w:tc>
-          <w:tcPr>
-            <w:tcW w:type="dxa" w:w="2160"/>
-          </w:tcPr>
-          <w:p/>
-        </w:tc>
-        <w:tc>
-          <w:tcPr>
-            <w:tcW w:type="dxa" w:w="2160"/>
-          </w:tcPr>
-          <w:p/>
-        </w:tc>
-      </w:tr>
-      <w:tr>
-        <w:tc>
-          <w:tcPr>
-            <w:tcW w:type="dxa" w:w="2160"/>
-          </w:tcPr>
-          <w:p>
-            <w:r>
-              <w:t>3.5</w:t>
-            </w:r>
-          </w:p>
-        </w:tc>
-        <w:tc>
-          <w:tcPr>
-            <w:tcW w:type="dxa" w:w="2160"/>
-          </w:tcPr>
-          <w:p>
-            <w:r>
-              <w:t>Выбор поставщика</w:t>
-            </w:r>
-          </w:p>
-        </w:tc>
-        <w:tc>
-          <w:tcPr>
-            <w:tcW w:type="dxa" w:w="2160"/>
-          </w:tcPr>
-          <w:p/>
-        </w:tc>
-        <w:tc>
-          <w:tcPr>
-            <w:tcW w:type="dxa" w:w="2160"/>
-          </w:tcPr>
-          <w:p/>
-        </w:tc>
-      </w:tr>
-      <w:tr>
-        <w:tc>
-          <w:tcPr>
-            <w:tcW w:type="dxa" w:w="2160"/>
-          </w:tcPr>
-          <w:p>
-            <w:r>
-              <w:t>3.6</w:t>
-            </w:r>
-          </w:p>
-        </w:tc>
-        <w:tc>
-          <w:tcPr>
-            <w:tcW w:type="dxa" w:w="2160"/>
-          </w:tcPr>
-          <w:p>
-            <w:r>
-              <w:t>Отслеживание статуса оплаты счета</w:t>
-            </w:r>
-          </w:p>
-        </w:tc>
-        <w:tc>
-          <w:tcPr>
-            <w:tcW w:type="dxa" w:w="2160"/>
-          </w:tcPr>
-          <w:p/>
-        </w:tc>
-        <w:tc>
-          <w:tcPr>
-            <w:tcW w:type="dxa" w:w="2160"/>
-          </w:tcPr>
-          <w:p/>
-        </w:tc>
-      </w:tr>
-      <w:tr>
-        <w:tc>
-          <w:tcPr>
-            <w:tcW w:type="dxa" w:w="2160"/>
-          </w:tcPr>
-          <w:p>
-            <w:r>
-              <w:t>3.7</w:t>
-            </w:r>
-          </w:p>
-        </w:tc>
-        <w:tc>
-          <w:tcPr>
-            <w:tcW w:type="dxa" w:w="2160"/>
-          </w:tcPr>
-          <w:p>
-            <w:r>
-              <w:t>Процесс "переоценки поставщиков"</w:t>
-            </w:r>
-          </w:p>
-        </w:tc>
-        <w:tc>
-          <w:tcPr>
-            <w:tcW w:type="dxa" w:w="2160"/>
-          </w:tcPr>
-          <w:p/>
-        </w:tc>
-        <w:tc>
-          <w:tcPr>
-            <w:tcW w:type="dxa" w:w="2160"/>
-          </w:tcPr>
-          <w:p/>
-        </w:tc>
-      </w:tr>
-      <w:tr>
-        <w:tc>
-          <w:tcPr>
-            <w:tcW w:type="dxa" w:w="2160"/>
-          </w:tcPr>
-          <w:p>
-            <w:r>
-              <w:t>3.8</w:t>
-            </w:r>
-          </w:p>
-        </w:tc>
-        <w:tc>
-          <w:tcPr>
-            <w:tcW w:type="dxa" w:w="2160"/>
-          </w:tcPr>
-          <w:p>
-            <w:r>
-              <w:t>Учет поступления матери��лов на объект/склад</w:t>
-            </w:r>
-          </w:p>
-        </w:tc>
-        <w:tc>
-          <w:tcPr>
-            <w:tcW w:type="dxa" w:w="2160"/>
-          </w:tcPr>
-          <w:p/>
-        </w:tc>
-        <w:tc>
-          <w:tcPr>
-            <w:tcW w:type="dxa" w:w="2160"/>
-          </w:tcPr>
-          <w:p/>
-        </w:tc>
-      </w:tr>
-    </w:tbl>
-    <w:p>
-      <w:pPr>
-        <w:pStyle w:val="Heading1"/>
-      </w:pPr>
-      <w:r>
-        <w:t>Чек-лист 4. Подсистема «Учет рабочего времени и мотивация»</w:t>
-      </w:r>
-    </w:p>
-    <w:tbl>
-      <w:tblPr>
-        <w:tblStyle w:val="TableGrid"/>
-        <w:tblW w:type="auto" w:w="0"/>
-        <w:tblLook w:firstColumn="1" w:firstRow="1" w:lastColumn="0" w:lastRow="0" w:noHBand="0" w:noVBand="1" w:val="04A0"/>
-      </w:tblPr>
-      <w:tblGrid>
-        <w:gridCol w:w="2160"/>
-        <w:gridCol w:w="2160"/>
-        <w:gridCol w:w="2160"/>
-        <w:gridCol w:w="2160"/>
-      </w:tblGrid>
-      <w:tr>
-        <w:tc>
-          <w:tcPr>
-            <w:tcW w:type="dxa" w:w="2160"/>
-          </w:tcPr>
-          <w:p>
-            <w:r>
-              <w:t>№</w:t>
-            </w:r>
-          </w:p>
-        </w:tc>
-        <w:tc>
-          <w:tcPr>
-            <w:tcW w:type="dxa" w:w="2160"/>
-          </w:tcPr>
-          <w:p>
-            <w:r>
-              <w:t>Наименование проверки</w:t>
-            </w:r>
-          </w:p>
-        </w:tc>
-        <w:tc>
-          <w:tcPr>
-            <w:tcW w:type="dxa" w:w="2160"/>
-          </w:tcPr>
-          <w:p>
-            <w:r>
-              <w:t>Статус</w:t>
-            </w:r>
-          </w:p>
-        </w:tc>
-        <w:tc>
-          <w:tcPr>
-            <w:tcW w:type="dxa" w:w="2160"/>
-          </w:tcPr>
-          <w:p>
-            <w:r>
-              <w:t>Примечание</w:t>
+              <w:t>Высокий</w:t>
             </w:r>
           </w:p>
         </w:tc>
@@ -1304,7 +708,7 @@
           </w:tcPr>
           <w:p>
             <w:r>
-              <w:t>4.1</w:t>
+              <w:t>COV-PK-004</w:t>
             </w:r>
           </w:p>
         </w:tc>
@@ -1314,31 +718,7 @@
           </w:tcPr>
           <w:p>
             <w:r>
-              <w:t>Учет фактически отработанного времени</w:t>
-            </w:r>
-          </w:p>
-        </w:tc>
-        <w:tc>
-          <w:tcPr>
-            <w:tcW w:type="dxa" w:w="2160"/>
-          </w:tcPr>
-          <w:p/>
-        </w:tc>
-        <w:tc>
-          <w:tcPr>
-            <w:tcW w:type="dxa" w:w="2160"/>
-          </w:tcPr>
-          <w:p/>
-        </w:tc>
-      </w:tr>
-      <w:tr>
-        <w:tc>
-          <w:tcPr>
-            <w:tcW w:type="dxa" w:w="2160"/>
-          </w:tcPr>
-          <w:p>
-            <w:r>
-              <w:t>4.2</w:t>
+              <w:t>Учет трудозатрат</w:t>
             </w:r>
           </w:p>
         </w:tc>
@@ -1348,31 +728,7 @@
           </w:tcPr>
           <w:p>
             <w:r>
-              <w:t>Анализ переработок</w:t>
-            </w:r>
-          </w:p>
-        </w:tc>
-        <w:tc>
-          <w:tcPr>
-            <w:tcW w:type="dxa" w:w="2160"/>
-          </w:tcPr>
-          <w:p/>
-        </w:tc>
-        <w:tc>
-          <w:tcPr>
-            <w:tcW w:type="dxa" w:w="2160"/>
-          </w:tcPr>
-          <w:p/>
-        </w:tc>
-      </w:tr>
-      <w:tr>
-        <w:tc>
-          <w:tcPr>
-            <w:tcW w:type="dxa" w:w="2160"/>
-          </w:tcPr>
-          <w:p>
-            <w:r>
-              <w:t>4.3</w:t>
+              <w:t>Проверка фиксации плановых и фактических трудозатрат</w:t>
             </w:r>
           </w:p>
         </w:tc>
@@ -1382,150 +738,7 @@
           </w:tcPr>
           <w:p>
             <w:r>
-              <w:t>Привязка системы мотивации к выполненным задачам</w:t>
-            </w:r>
-          </w:p>
-        </w:tc>
-        <w:tc>
-          <w:tcPr>
-            <w:tcW w:type="dxa" w:w="2160"/>
-          </w:tcPr>
-          <w:p/>
-        </w:tc>
-        <w:tc>
-          <w:tcPr>
-            <w:tcW w:type="dxa" w:w="2160"/>
-          </w:tcPr>
-          <w:p/>
-        </w:tc>
-      </w:tr>
-      <w:tr>
-        <w:tc>
-          <w:tcPr>
-            <w:tcW w:type="dxa" w:w="2160"/>
-          </w:tcPr>
-          <w:p>
-            <w:r>
-              <w:t>4.4</w:t>
-            </w:r>
-          </w:p>
-        </w:tc>
-        <w:tc>
-          <w:tcPr>
-            <w:tcW w:type="dxa" w:w="2160"/>
-          </w:tcPr>
-          <w:p>
-            <w:r>
-              <w:t>Расчет сдельной части зарплаты</w:t>
-            </w:r>
-          </w:p>
-        </w:tc>
-        <w:tc>
-          <w:tcPr>
-            <w:tcW w:type="dxa" w:w="2160"/>
-          </w:tcPr>
-          <w:p/>
-        </w:tc>
-        <w:tc>
-          <w:tcPr>
-            <w:tcW w:type="dxa" w:w="2160"/>
-          </w:tcPr>
-          <w:p/>
-        </w:tc>
-      </w:tr>
-      <w:tr>
-        <w:tc>
-          <w:tcPr>
-            <w:tcW w:type="dxa" w:w="2160"/>
-          </w:tcPr>
-          <w:p>
-            <w:r>
-              <w:t>4.5</w:t>
-            </w:r>
-          </w:p>
-        </w:tc>
-        <w:tc>
-          <w:tcPr>
-            <w:tcW w:type="dxa" w:w="2160"/>
-          </w:tcPr>
-          <w:p>
-            <w:r>
-              <w:t>Анализ эффективности сотрудников</w:t>
-            </w:r>
-          </w:p>
-        </w:tc>
-        <w:tc>
-          <w:tcPr>
-            <w:tcW w:type="dxa" w:w="2160"/>
-          </w:tcPr>
-          <w:p/>
-        </w:tc>
-        <w:tc>
-          <w:tcPr>
-            <w:tcW w:type="dxa" w:w="2160"/>
-          </w:tcPr>
-          <w:p/>
-        </w:tc>
-      </w:tr>
-    </w:tbl>
-    <w:p>
-      <w:pPr>
-        <w:pStyle w:val="Heading1"/>
-      </w:pPr>
-      <w:r>
-        <w:t>Чек-лист 5. Подсистема «Документооборот»</w:t>
-      </w:r>
-    </w:p>
-    <w:tbl>
-      <w:tblPr>
-        <w:tblStyle w:val="TableGrid"/>
-        <w:tblW w:type="auto" w:w="0"/>
-        <w:tblLook w:firstColumn="1" w:firstRow="1" w:lastColumn="0" w:lastRow="0" w:noHBand="0" w:noVBand="1" w:val="04A0"/>
-      </w:tblPr>
-      <w:tblGrid>
-        <w:gridCol w:w="2160"/>
-        <w:gridCol w:w="2160"/>
-        <w:gridCol w:w="2160"/>
-        <w:gridCol w:w="2160"/>
-      </w:tblGrid>
-      <w:tr>
-        <w:tc>
-          <w:tcPr>
-            <w:tcW w:type="dxa" w:w="2160"/>
-          </w:tcPr>
-          <w:p>
-            <w:r>
-              <w:t>№</w:t>
-            </w:r>
-          </w:p>
-        </w:tc>
-        <w:tc>
-          <w:tcPr>
-            <w:tcW w:type="dxa" w:w="2160"/>
-          </w:tcPr>
-          <w:p>
-            <w:r>
-              <w:t>Наименование проверки</w:t>
-            </w:r>
-          </w:p>
-        </w:tc>
-        <w:tc>
-          <w:tcPr>
-            <w:tcW w:type="dxa" w:w="2160"/>
-          </w:tcPr>
-          <w:p>
-            <w:r>
-              <w:t>Статус</w:t>
-            </w:r>
-          </w:p>
-        </w:tc>
-        <w:tc>
-          <w:tcPr>
-            <w:tcW w:type="dxa" w:w="2160"/>
-          </w:tcPr>
-          <w:p>
-            <w:r>
-              <w:t>Примечание</w:t>
+              <w:t>Высокий</w:t>
             </w:r>
           </w:p>
         </w:tc>
@@ -1537,7 +750,7 @@
           </w:tcPr>
           <w:p>
             <w:r>
-              <w:t>5.1</w:t>
+              <w:t>COV-PK-005</w:t>
             </w:r>
           </w:p>
         </w:tc>
@@ -1547,31 +760,7 @@
           </w:tcPr>
           <w:p>
             <w:r>
-              <w:t>Хранение типовых договоров</w:t>
-            </w:r>
-          </w:p>
-        </w:tc>
-        <w:tc>
-          <w:tcPr>
-            <w:tcW w:type="dxa" w:w="2160"/>
-          </w:tcPr>
-          <w:p/>
-        </w:tc>
-        <w:tc>
-          <w:tcPr>
-            <w:tcW w:type="dxa" w:w="2160"/>
-          </w:tcPr>
-          <w:p/>
-        </w:tc>
-      </w:tr>
-      <w:tr>
-        <w:tc>
-          <w:tcPr>
-            <w:tcW w:type="dxa" w:w="2160"/>
-          </w:tcPr>
-          <w:p>
-            <w:r>
-              <w:t>5.2</w:t>
+              <w:t>Снабжение и склад</w:t>
             </w:r>
           </w:p>
         </w:tc>
@@ -1581,31 +770,7 @@
           </w:tcPr>
           <w:p>
             <w:r>
-              <w:t>Генерация договора на основе данных клиента и проекта</w:t>
-            </w:r>
-          </w:p>
-        </w:tc>
-        <w:tc>
-          <w:tcPr>
-            <w:tcW w:type="dxa" w:w="2160"/>
-          </w:tcPr>
-          <w:p/>
-        </w:tc>
-        <w:tc>
-          <w:tcPr>
-            <w:tcW w:type="dxa" w:w="2160"/>
-          </w:tcPr>
-          <w:p/>
-        </w:tc>
-      </w:tr>
-      <w:tr>
-        <w:tc>
-          <w:tcPr>
-            <w:tcW w:type="dxa" w:w="2160"/>
-          </w:tcPr>
-          <w:p>
-            <w:r>
-              <w:t>5.3</w:t>
+              <w:t>Проверка управления закупками и номенклатурой</w:t>
             </w:r>
           </w:p>
         </w:tc>
@@ -1615,116 +780,7 @@
           </w:tcPr>
           <w:p>
             <w:r>
-              <w:t>Фиксация факта подписания договора</w:t>
-            </w:r>
-          </w:p>
-        </w:tc>
-        <w:tc>
-          <w:tcPr>
-            <w:tcW w:type="dxa" w:w="2160"/>
-          </w:tcPr>
-          <w:p/>
-        </w:tc>
-        <w:tc>
-          <w:tcPr>
-            <w:tcW w:type="dxa" w:w="2160"/>
-          </w:tcPr>
-          <w:p/>
-        </w:tc>
-      </w:tr>
-      <w:tr>
-        <w:tc>
-          <w:tcPr>
-            <w:tcW w:type="dxa" w:w="2160"/>
-          </w:tcPr>
-          <w:p>
-            <w:r>
-              <w:t>5.4</w:t>
-            </w:r>
-          </w:p>
-        </w:tc>
-        <w:tc>
-          <w:tcPr>
-            <w:tcW w:type="dxa" w:w="2160"/>
-          </w:tcPr>
-          <w:p>
-            <w:r>
-              <w:t>Фиксация получения аванса</w:t>
-            </w:r>
-          </w:p>
-        </w:tc>
-        <w:tc>
-          <w:tcPr>
-            <w:tcW w:type="dxa" w:w="2160"/>
-          </w:tcPr>
-          <w:p/>
-        </w:tc>
-        <w:tc>
-          <w:tcPr>
-            <w:tcW w:type="dxa" w:w="2160"/>
-          </w:tcPr>
-          <w:p/>
-        </w:tc>
-      </w:tr>
-    </w:tbl>
-    <w:p>
-      <w:pPr>
-        <w:pStyle w:val="Heading1"/>
-      </w:pPr>
-      <w:r>
-        <w:t>Чек-лист 6. Разграничение доступа и интеграция подсистем</w:t>
-      </w:r>
-    </w:p>
-    <w:tbl>
-      <w:tblPr>
-        <w:tblStyle w:val="TableGrid"/>
-        <w:tblW w:type="auto" w:w="0"/>
-        <w:tblLook w:firstColumn="1" w:firstRow="1" w:lastColumn="0" w:lastRow="0" w:noHBand="0" w:noVBand="1" w:val="04A0"/>
-      </w:tblPr>
-      <w:tblGrid>
-        <w:gridCol w:w="2160"/>
-        <w:gridCol w:w="2160"/>
-        <w:gridCol w:w="2160"/>
-        <w:gridCol w:w="2160"/>
-      </w:tblGrid>
-      <w:tr>
-        <w:tc>
-          <w:tcPr>
-            <w:tcW w:type="dxa" w:w="2160"/>
-          </w:tcPr>
-          <w:p>
-            <w:r>
-              <w:t>№</w:t>
-            </w:r>
-          </w:p>
-        </w:tc>
-        <w:tc>
-          <w:tcPr>
-            <w:tcW w:type="dxa" w:w="2160"/>
-          </w:tcPr>
-          <w:p>
-            <w:r>
-              <w:t>Наименование проверки</w:t>
-            </w:r>
-          </w:p>
-        </w:tc>
-        <w:tc>
-          <w:tcPr>
-            <w:tcW w:type="dxa" w:w="2160"/>
-          </w:tcPr>
-          <w:p>
-            <w:r>
-              <w:t>Статус</w:t>
-            </w:r>
-          </w:p>
-        </w:tc>
-        <w:tc>
-          <w:tcPr>
-            <w:tcW w:type="dxa" w:w="2160"/>
-          </w:tcPr>
-          <w:p>
-            <w:r>
-              <w:t>Примечание</w:t>
+              <w:t>Средний</w:t>
             </w:r>
           </w:p>
         </w:tc>
@@ -1736,7 +792,7 @@
           </w:tcPr>
           <w:p>
             <w:r>
-              <w:t>6.1</w:t>
+              <w:t>COV-PK-006</w:t>
             </w:r>
           </w:p>
         </w:tc>
@@ -1746,7 +802,7 @@
           </w:tcPr>
           <w:p>
             <w:r>
-              <w:t>Разграничение прав доступа по ролям</w:t>
+              <w:t>Документооборот</w:t>
             </w:r>
           </w:p>
         </w:tc>
@@ -1754,13 +810,21 @@
           <w:tcPr>
             <w:tcW w:type="dxa" w:w="2160"/>
           </w:tcPr>
-          <w:p/>
+          <w:p>
+            <w:r>
+              <w:t>Проверка генерации и хранения договоров</w:t>
+            </w:r>
+          </w:p>
         </w:tc>
         <w:tc>
           <w:tcPr>
             <w:tcW w:type="dxa" w:w="2160"/>
           </w:tcPr>
-          <w:p/>
+          <w:p>
+            <w:r>
+              <w:t>Средний</w:t>
+            </w:r>
+          </w:p>
         </w:tc>
       </w:tr>
       <w:tr>
@@ -1770,7 +834,7 @@
           </w:tcPr>
           <w:p>
             <w:r>
-              <w:t>6.2</w:t>
+              <w:t>COV-PK-007</w:t>
             </w:r>
           </w:p>
         </w:tc>
@@ -1780,7 +844,7 @@
           </w:tcPr>
           <w:p>
             <w:r>
-              <w:t>Информационное взаимодействие между подсистемами</w:t>
+              <w:t>Завершение проекта</w:t>
             </w:r>
           </w:p>
         </w:tc>
@@ -1788,13 +852,21 @@
           <w:tcPr>
             <w:tcW w:type="dxa" w:w="2160"/>
           </w:tcPr>
-          <w:p/>
+          <w:p>
+            <w:r>
+              <w:t>Проверка перевода проекта в итоговое состояние</w:t>
+            </w:r>
+          </w:p>
         </w:tc>
         <w:tc>
           <w:tcPr>
             <w:tcW w:type="dxa" w:w="2160"/>
           </w:tcPr>
-          <w:p/>
+          <w:p>
+            <w:r>
+              <w:t>Высокий</w:t>
+            </w:r>
+          </w:p>
         </w:tc>
       </w:tr>
       <w:tr>
@@ -1804,7 +876,7 @@
           </w:tcPr>
           <w:p>
             <w:r>
-              <w:t>6.3</w:t>
+              <w:t>COV-PK-008</w:t>
             </w:r>
           </w:p>
         </w:tc>
@@ -1814,7 +886,7 @@
           </w:tcPr>
           <w:p>
             <w:r>
-              <w:t>Единые справочники (клиенты, сотрудники, номенклатура, поставщики)</w:t>
+              <w:t>Разграничение доступа</w:t>
             </w:r>
           </w:p>
         </w:tc>
@@ -1822,13 +894,21 @@
           <w:tcPr>
             <w:tcW w:type="dxa" w:w="2160"/>
           </w:tcPr>
-          <w:p/>
+          <w:p>
+            <w:r>
+              <w:t>Проверка прав доступа по ролям</w:t>
+            </w:r>
+          </w:p>
         </w:tc>
         <w:tc>
           <w:tcPr>
             <w:tcW w:type="dxa" w:w="2160"/>
           </w:tcPr>
-          <w:p/>
+          <w:p>
+            <w:r>
+              <w:t>Высокий</w:t>
+            </w:r>
+          </w:p>
         </w:tc>
       </w:tr>
       <w:tr>
@@ -1838,7 +918,7 @@
           </w:tcPr>
           <w:p>
             <w:r>
-              <w:t>6.4</w:t>
+              <w:t>COV-PK-009</w:t>
             </w:r>
           </w:p>
         </w:tc>
@@ -1848,31 +928,7 @@
           </w:tcPr>
           <w:p>
             <w:r>
-              <w:t>Контроль целостности данных</w:t>
-            </w:r>
-          </w:p>
-        </w:tc>
-        <w:tc>
-          <w:tcPr>
-            <w:tcW w:type="dxa" w:w="2160"/>
-          </w:tcPr>
-          <w:p/>
-        </w:tc>
-        <w:tc>
-          <w:tcPr>
-            <w:tcW w:type="dxa" w:w="2160"/>
-          </w:tcPr>
-          <w:p/>
-        </w:tc>
-      </w:tr>
-      <w:tr>
-        <w:tc>
-          <w:tcPr>
-            <w:tcW w:type="dxa" w:w="2160"/>
-          </w:tcPr>
-          <w:p>
-            <w:r>
-              <w:t>6.5</w:t>
+              <w:t>Интеграция подсистем</w:t>
             </w:r>
           </w:p>
         </w:tc>
@@ -1882,7 +938,7 @@
           </w:tcPr>
           <w:p>
             <w:r>
-              <w:t>Кроссплатформенный доступ (веб, мобильные приложения)</w:t>
+              <w:t>Проверка информационного взаимодействия между подсистемами</w:t>
             </w:r>
           </w:p>
         </w:tc>
@@ -1890,16 +946,1579 @@
           <w:tcPr>
             <w:tcW w:type="dxa" w:w="2160"/>
           </w:tcPr>
+          <w:p>
+            <w:r>
+              <w:t>Средний</w:t>
+            </w:r>
+          </w:p>
+        </w:tc>
+      </w:tr>
+    </w:tbl>
+    <w:p>
+      <w:pPr>
+        <w:pStyle w:val="Heading1"/>
+      </w:pPr>
+      <w:r>
+        <w:t>4. Контрольные примеры</w:t>
+      </w:r>
+    </w:p>
+    <w:tbl>
+      <w:tblPr>
+        <w:tblStyle w:val="TableGrid"/>
+        <w:tblW w:type="auto" w:w="0"/>
+        <w:tblLook w:firstColumn="1" w:firstRow="1" w:lastColumn="0" w:lastRow="0" w:noHBand="0" w:noVBand="1" w:val="04A0"/>
+      </w:tblPr>
+      <w:tblGrid>
+        <w:gridCol w:w="960"/>
+        <w:gridCol w:w="960"/>
+        <w:gridCol w:w="960"/>
+        <w:gridCol w:w="960"/>
+        <w:gridCol w:w="960"/>
+        <w:gridCol w:w="960"/>
+        <w:gridCol w:w="960"/>
+        <w:gridCol w:w="960"/>
+        <w:gridCol w:w="960"/>
+      </w:tblGrid>
+      <w:tr>
+        <w:tc>
+          <w:tcPr>
+            <w:tcW w:type="dxa" w:w="960"/>
+            <w:shd w:fill="4472C4"/>
+          </w:tcPr>
+          <w:p>
+            <w:r>
+              <w:t>ID</w:t>
+            </w:r>
+          </w:p>
+        </w:tc>
+        <w:tc>
+          <w:tcPr>
+            <w:tcW w:type="dxa" w:w="960"/>
+            <w:shd w:fill="4472C4"/>
+          </w:tcPr>
+          <w:p>
+            <w:r>
+              <w:t>ID покрытия</w:t>
+            </w:r>
+          </w:p>
+        </w:tc>
+        <w:tc>
+          <w:tcPr>
+            <w:tcW w:type="dxa" w:w="960"/>
+            <w:shd w:fill="4472C4"/>
+          </w:tcPr>
+          <w:p>
+            <w:r>
+              <w:t>Наименование</w:t>
+            </w:r>
+          </w:p>
+        </w:tc>
+        <w:tc>
+          <w:tcPr>
+            <w:tcW w:type="dxa" w:w="960"/>
+            <w:shd w:fill="4472C4"/>
+          </w:tcPr>
+          <w:p>
+            <w:r>
+              <w:t>Приоритет</w:t>
+            </w:r>
+          </w:p>
+        </w:tc>
+        <w:tc>
+          <w:tcPr>
+            <w:tcW w:type="dxa" w:w="960"/>
+            <w:shd w:fill="4472C4"/>
+          </w:tcPr>
+          <w:p>
+            <w:r>
+              <w:t>Предусловие</w:t>
+            </w:r>
+          </w:p>
+        </w:tc>
+        <w:tc>
+          <w:tcPr>
+            <w:tcW w:type="dxa" w:w="960"/>
+            <w:shd w:fill="4472C4"/>
+          </w:tcPr>
+          <w:p>
+            <w:r>
+              <w:t>Шаги</w:t>
+            </w:r>
+          </w:p>
+        </w:tc>
+        <w:tc>
+          <w:tcPr>
+            <w:tcW w:type="dxa" w:w="960"/>
+            <w:shd w:fill="4472C4"/>
+          </w:tcPr>
+          <w:p>
+            <w:r>
+              <w:t>Ожидаемый результат</w:t>
+            </w:r>
+          </w:p>
+        </w:tc>
+        <w:tc>
+          <w:tcPr>
+            <w:tcW w:type="dxa" w:w="960"/>
+            <w:shd w:fill="4472C4"/>
+          </w:tcPr>
+          <w:p>
+            <w:r>
+              <w:t>Факт. результат</w:t>
+            </w:r>
+          </w:p>
+        </w:tc>
+        <w:tc>
+          <w:tcPr>
+            <w:tcW w:type="dxa" w:w="960"/>
+            <w:shd w:fill="4472C4"/>
+          </w:tcPr>
+          <w:p>
+            <w:r>
+              <w:t>Статус</w:t>
+            </w:r>
+          </w:p>
+        </w:tc>
+      </w:tr>
+      <w:tr>
+        <w:tc>
+          <w:tcPr>
+            <w:tcW w:type="dxa" w:w="960"/>
+          </w:tcPr>
+          <w:p>
+            <w:r>
+              <w:t>TC-PK-001</w:t>
+            </w:r>
+          </w:p>
+        </w:tc>
+        <w:tc>
+          <w:tcPr>
+            <w:tcW w:type="dxa" w:w="960"/>
+          </w:tcPr>
+          <w:p>
+            <w:r>
+              <w:t>COV-PK-001</w:t>
+            </w:r>
+          </w:p>
+        </w:tc>
+        <w:tc>
+          <w:tcPr>
+            <w:tcW w:type="dxa" w:w="960"/>
+          </w:tcPr>
+          <w:p>
+            <w:r>
+              <w:t>Фиксация входящего обращения</w:t>
+            </w:r>
+          </w:p>
+        </w:tc>
+        <w:tc>
+          <w:tcPr>
+            <w:tcW w:type="dxa" w:w="960"/>
+          </w:tcPr>
+          <w:p>
+            <w:r>
+              <w:t>Высокий</w:t>
+            </w:r>
+          </w:p>
+        </w:tc>
+        <w:tc>
+          <w:tcPr>
+            <w:tcW w:type="dxa" w:w="960"/>
+          </w:tcPr>
+          <w:p>
+            <w:r>
+              <w:t>Система доступна</w:t>
+            </w:r>
+          </w:p>
+        </w:tc>
+        <w:tc>
+          <w:tcPr>
+            <w:tcW w:type="dxa" w:w="960"/>
+          </w:tcPr>
+          <w:p>
+            <w:r>
+              <w:t>Создать новое обращение с указанием источника</w:t>
+            </w:r>
+          </w:p>
+        </w:tc>
+        <w:tc>
+          <w:tcPr>
+            <w:tcW w:type="dxa" w:w="960"/>
+          </w:tcPr>
+          <w:p>
+            <w:r>
+              <w:t>Обращение сохранено с корректными данными</w:t>
+            </w:r>
+          </w:p>
+        </w:tc>
+        <w:tc>
+          <w:tcPr>
+            <w:tcW w:type="dxa" w:w="960"/>
+          </w:tcPr>
           <w:p/>
         </w:tc>
         <w:tc>
           <w:tcPr>
-            <w:tcW w:type="dxa" w:w="2160"/>
+            <w:tcW w:type="dxa" w:w="960"/>
+          </w:tcPr>
+          <w:p/>
+        </w:tc>
+      </w:tr>
+      <w:tr>
+        <w:tc>
+          <w:tcPr>
+            <w:tcW w:type="dxa" w:w="960"/>
+          </w:tcPr>
+          <w:p>
+            <w:r>
+              <w:t>TC-PK-002</w:t>
+            </w:r>
+          </w:p>
+        </w:tc>
+        <w:tc>
+          <w:tcPr>
+            <w:tcW w:type="dxa" w:w="960"/>
+          </w:tcPr>
+          <w:p>
+            <w:r>
+              <w:t>COV-PK-001</w:t>
+            </w:r>
+          </w:p>
+        </w:tc>
+        <w:tc>
+          <w:tcPr>
+            <w:tcW w:type="dxa" w:w="960"/>
+          </w:tcPr>
+          <w:p>
+            <w:r>
+              <w:t>Проверка статусов сделки</w:t>
+            </w:r>
+          </w:p>
+        </w:tc>
+        <w:tc>
+          <w:tcPr>
+            <w:tcW w:type="dxa" w:w="960"/>
+          </w:tcPr>
+          <w:p>
+            <w:r>
+              <w:t>Высокий</w:t>
+            </w:r>
+          </w:p>
+        </w:tc>
+        <w:tc>
+          <w:tcPr>
+            <w:tcW w:type="dxa" w:w="960"/>
+          </w:tcPr>
+          <w:p>
+            <w:r>
+              <w:t>Обращение создано</w:t>
+            </w:r>
+          </w:p>
+        </w:tc>
+        <w:tc>
+          <w:tcPr>
+            <w:tcW w:type="dxa" w:w="960"/>
+          </w:tcPr>
+          <w:p>
+            <w:r>
+              <w:t>Изменить статус сделки</w:t>
+            </w:r>
+          </w:p>
+        </w:tc>
+        <w:tc>
+          <w:tcPr>
+            <w:tcW w:type="dxa" w:w="960"/>
+          </w:tcPr>
+          <w:p>
+            <w:r>
+              <w:t>Статус изменен и отображается корректно</w:t>
+            </w:r>
+          </w:p>
+        </w:tc>
+        <w:tc>
+          <w:tcPr>
+            <w:tcW w:type="dxa" w:w="960"/>
+          </w:tcPr>
+          <w:p/>
+        </w:tc>
+        <w:tc>
+          <w:tcPr>
+            <w:tcW w:type="dxa" w:w="960"/>
+          </w:tcPr>
+          <w:p/>
+        </w:tc>
+      </w:tr>
+      <w:tr>
+        <w:tc>
+          <w:tcPr>
+            <w:tcW w:type="dxa" w:w="960"/>
+          </w:tcPr>
+          <w:p>
+            <w:r>
+              <w:t>TC-PK-003</w:t>
+            </w:r>
+          </w:p>
+        </w:tc>
+        <w:tc>
+          <w:tcPr>
+            <w:tcW w:type="dxa" w:w="960"/>
+          </w:tcPr>
+          <w:p>
+            <w:r>
+              <w:t>COV-PK-002</w:t>
+            </w:r>
+          </w:p>
+        </w:tc>
+        <w:tc>
+          <w:tcPr>
+            <w:tcW w:type="dxa" w:w="960"/>
+          </w:tcPr>
+          <w:p>
+            <w:r>
+              <w:t>Создание карточки проекта</w:t>
+            </w:r>
+          </w:p>
+        </w:tc>
+        <w:tc>
+          <w:tcPr>
+            <w:tcW w:type="dxa" w:w="960"/>
+          </w:tcPr>
+          <w:p>
+            <w:r>
+              <w:t>Высокий</w:t>
+            </w:r>
+          </w:p>
+        </w:tc>
+        <w:tc>
+          <w:tcPr>
+            <w:tcW w:type="dxa" w:w="960"/>
+          </w:tcPr>
+          <w:p>
+            <w:r>
+              <w:t>Опросный лист утвержден</w:t>
+            </w:r>
+          </w:p>
+        </w:tc>
+        <w:tc>
+          <w:tcPr>
+            <w:tcW w:type="dxa" w:w="960"/>
+          </w:tcPr>
+          <w:p>
+            <w:r>
+              <w:t>Создать проект на основе ТЗ</w:t>
+            </w:r>
+          </w:p>
+        </w:tc>
+        <w:tc>
+          <w:tcPr>
+            <w:tcW w:type="dxa" w:w="960"/>
+          </w:tcPr>
+          <w:p>
+            <w:r>
+              <w:t>Проект создан, карточка доступна</w:t>
+            </w:r>
+          </w:p>
+        </w:tc>
+        <w:tc>
+          <w:tcPr>
+            <w:tcW w:type="dxa" w:w="960"/>
+          </w:tcPr>
+          <w:p/>
+        </w:tc>
+        <w:tc>
+          <w:tcPr>
+            <w:tcW w:type="dxa" w:w="960"/>
+          </w:tcPr>
+          <w:p/>
+        </w:tc>
+      </w:tr>
+      <w:tr>
+        <w:tc>
+          <w:tcPr>
+            <w:tcW w:type="dxa" w:w="960"/>
+          </w:tcPr>
+          <w:p>
+            <w:r>
+              <w:t>TC-PK-004</w:t>
+            </w:r>
+          </w:p>
+        </w:tc>
+        <w:tc>
+          <w:tcPr>
+            <w:tcW w:type="dxa" w:w="960"/>
+          </w:tcPr>
+          <w:p>
+            <w:r>
+              <w:t>COV-PK-002</w:t>
+            </w:r>
+          </w:p>
+        </w:tc>
+        <w:tc>
+          <w:tcPr>
+            <w:tcW w:type="dxa" w:w="960"/>
+          </w:tcPr>
+          <w:p>
+            <w:r>
+              <w:t>Ведение проектной документации</w:t>
+            </w:r>
+          </w:p>
+        </w:tc>
+        <w:tc>
+          <w:tcPr>
+            <w:tcW w:type="dxa" w:w="960"/>
+          </w:tcPr>
+          <w:p>
+            <w:r>
+              <w:t>Высокий</w:t>
+            </w:r>
+          </w:p>
+        </w:tc>
+        <w:tc>
+          <w:tcPr>
+            <w:tcW w:type="dxa" w:w="960"/>
+          </w:tcPr>
+          <w:p>
+            <w:r>
+              <w:t>Проект существует</w:t>
+            </w:r>
+          </w:p>
+        </w:tc>
+        <w:tc>
+          <w:tcPr>
+            <w:tcW w:type="dxa" w:w="960"/>
+          </w:tcPr>
+          <w:p>
+            <w:r>
+              <w:t>Добавить документы к проекту</w:t>
+            </w:r>
+          </w:p>
+        </w:tc>
+        <w:tc>
+          <w:tcPr>
+            <w:tcW w:type="dxa" w:w="960"/>
+          </w:tcPr>
+          <w:p>
+            <w:r>
+              <w:t>Документы прикреплены и доступны</w:t>
+            </w:r>
+          </w:p>
+        </w:tc>
+        <w:tc>
+          <w:tcPr>
+            <w:tcW w:type="dxa" w:w="960"/>
+          </w:tcPr>
+          <w:p/>
+        </w:tc>
+        <w:tc>
+          <w:tcPr>
+            <w:tcW w:type="dxa" w:w="960"/>
+          </w:tcPr>
+          <w:p/>
+        </w:tc>
+      </w:tr>
+      <w:tr>
+        <w:tc>
+          <w:tcPr>
+            <w:tcW w:type="dxa" w:w="960"/>
+          </w:tcPr>
+          <w:p>
+            <w:r>
+              <w:t>TC-PK-005</w:t>
+            </w:r>
+          </w:p>
+        </w:tc>
+        <w:tc>
+          <w:tcPr>
+            <w:tcW w:type="dxa" w:w="960"/>
+          </w:tcPr>
+          <w:p>
+            <w:r>
+              <w:t>COV-PK-003</w:t>
+            </w:r>
+          </w:p>
+        </w:tc>
+        <w:tc>
+          <w:tcPr>
+            <w:tcW w:type="dxa" w:w="960"/>
+          </w:tcPr>
+          <w:p>
+            <w:r>
+              <w:t>Создание этапа проекта</w:t>
+            </w:r>
+          </w:p>
+        </w:tc>
+        <w:tc>
+          <w:tcPr>
+            <w:tcW w:type="dxa" w:w="960"/>
+          </w:tcPr>
+          <w:p>
+            <w:r>
+              <w:t>Высокий</w:t>
+            </w:r>
+          </w:p>
+        </w:tc>
+        <w:tc>
+          <w:tcPr>
+            <w:tcW w:type="dxa" w:w="960"/>
+          </w:tcPr>
+          <w:p>
+            <w:r>
+              <w:t>Проект существует</w:t>
+            </w:r>
+          </w:p>
+        </w:tc>
+        <w:tc>
+          <w:tcPr>
+            <w:tcW w:type="dxa" w:w="960"/>
+          </w:tcPr>
+          <w:p>
+            <w:r>
+              <w:t>Добавить этап проекта</w:t>
+            </w:r>
+          </w:p>
+        </w:tc>
+        <w:tc>
+          <w:tcPr>
+            <w:tcW w:type="dxa" w:w="960"/>
+          </w:tcPr>
+          <w:p>
+            <w:r>
+              <w:t>Этап создан и отображается</w:t>
+            </w:r>
+          </w:p>
+        </w:tc>
+        <w:tc>
+          <w:tcPr>
+            <w:tcW w:type="dxa" w:w="960"/>
+          </w:tcPr>
+          <w:p/>
+        </w:tc>
+        <w:tc>
+          <w:tcPr>
+            <w:tcW w:type="dxa" w:w="960"/>
+          </w:tcPr>
+          <w:p/>
+        </w:tc>
+      </w:tr>
+      <w:tr>
+        <w:tc>
+          <w:tcPr>
+            <w:tcW w:type="dxa" w:w="960"/>
+          </w:tcPr>
+          <w:p>
+            <w:r>
+              <w:t>TC-PK-006</w:t>
+            </w:r>
+          </w:p>
+        </w:tc>
+        <w:tc>
+          <w:tcPr>
+            <w:tcW w:type="dxa" w:w="960"/>
+          </w:tcPr>
+          <w:p>
+            <w:r>
+              <w:t>COV-PK-003</w:t>
+            </w:r>
+          </w:p>
+        </w:tc>
+        <w:tc>
+          <w:tcPr>
+            <w:tcW w:type="dxa" w:w="960"/>
+          </w:tcPr>
+          <w:p>
+            <w:r>
+              <w:t>Назначение задачи</w:t>
+            </w:r>
+          </w:p>
+        </w:tc>
+        <w:tc>
+          <w:tcPr>
+            <w:tcW w:type="dxa" w:w="960"/>
+          </w:tcPr>
+          <w:p>
+            <w:r>
+              <w:t>Средний</w:t>
+            </w:r>
+          </w:p>
+        </w:tc>
+        <w:tc>
+          <w:tcPr>
+            <w:tcW w:type="dxa" w:w="960"/>
+          </w:tcPr>
+          <w:p>
+            <w:r>
+              <w:t>Этап существует</w:t>
+            </w:r>
+          </w:p>
+        </w:tc>
+        <w:tc>
+          <w:tcPr>
+            <w:tcW w:type="dxa" w:w="960"/>
+          </w:tcPr>
+          <w:p>
+            <w:r>
+              <w:t>Создать задачу и назначить исполнителя</w:t>
+            </w:r>
+          </w:p>
+        </w:tc>
+        <w:tc>
+          <w:tcPr>
+            <w:tcW w:type="dxa" w:w="960"/>
+          </w:tcPr>
+          <w:p>
+            <w:r>
+              <w:t>Задача создана и отображается у исполнителя</w:t>
+            </w:r>
+          </w:p>
+        </w:tc>
+        <w:tc>
+          <w:tcPr>
+            <w:tcW w:type="dxa" w:w="960"/>
+          </w:tcPr>
+          <w:p/>
+        </w:tc>
+        <w:tc>
+          <w:tcPr>
+            <w:tcW w:type="dxa" w:w="960"/>
+          </w:tcPr>
+          <w:p/>
+        </w:tc>
+      </w:tr>
+      <w:tr>
+        <w:tc>
+          <w:tcPr>
+            <w:tcW w:type="dxa" w:w="960"/>
+          </w:tcPr>
+          <w:p>
+            <w:r>
+              <w:t>TC-PK-007</w:t>
+            </w:r>
+          </w:p>
+        </w:tc>
+        <w:tc>
+          <w:tcPr>
+            <w:tcW w:type="dxa" w:w="960"/>
+          </w:tcPr>
+          <w:p>
+            <w:r>
+              <w:t>COV-PK-004</w:t>
+            </w:r>
+          </w:p>
+        </w:tc>
+        <w:tc>
+          <w:tcPr>
+            <w:tcW w:type="dxa" w:w="960"/>
+          </w:tcPr>
+          <w:p>
+            <w:r>
+              <w:t>Фиксация плановых трудозатрат</w:t>
+            </w:r>
+          </w:p>
+        </w:tc>
+        <w:tc>
+          <w:tcPr>
+            <w:tcW w:type="dxa" w:w="960"/>
+          </w:tcPr>
+          <w:p>
+            <w:r>
+              <w:t>Высокий</w:t>
+            </w:r>
+          </w:p>
+        </w:tc>
+        <w:tc>
+          <w:tcPr>
+            <w:tcW w:type="dxa" w:w="960"/>
+          </w:tcPr>
+          <w:p>
+            <w:r>
+              <w:t>Задача существует</w:t>
+            </w:r>
+          </w:p>
+        </w:tc>
+        <w:tc>
+          <w:tcPr>
+            <w:tcW w:type="dxa" w:w="960"/>
+          </w:tcPr>
+          <w:p>
+            <w:r>
+              <w:t>Указать плановые трудозатраты</w:t>
+            </w:r>
+          </w:p>
+        </w:tc>
+        <w:tc>
+          <w:tcPr>
+            <w:tcW w:type="dxa" w:w="960"/>
+          </w:tcPr>
+          <w:p>
+            <w:r>
+              <w:t>Трудозатраты сохранены</w:t>
+            </w:r>
+          </w:p>
+        </w:tc>
+        <w:tc>
+          <w:tcPr>
+            <w:tcW w:type="dxa" w:w="960"/>
+          </w:tcPr>
+          <w:p/>
+        </w:tc>
+        <w:tc>
+          <w:tcPr>
+            <w:tcW w:type="dxa" w:w="960"/>
+          </w:tcPr>
+          <w:p/>
+        </w:tc>
+      </w:tr>
+      <w:tr>
+        <w:tc>
+          <w:tcPr>
+            <w:tcW w:type="dxa" w:w="960"/>
+          </w:tcPr>
+          <w:p>
+            <w:r>
+              <w:t>TC-PK-008</w:t>
+            </w:r>
+          </w:p>
+        </w:tc>
+        <w:tc>
+          <w:tcPr>
+            <w:tcW w:type="dxa" w:w="960"/>
+          </w:tcPr>
+          <w:p>
+            <w:r>
+              <w:t>COV-PK-004</w:t>
+            </w:r>
+          </w:p>
+        </w:tc>
+        <w:tc>
+          <w:tcPr>
+            <w:tcW w:type="dxa" w:w="960"/>
+          </w:tcPr>
+          <w:p>
+            <w:r>
+              <w:t>Фиксация фактических трудозатрат</w:t>
+            </w:r>
+          </w:p>
+        </w:tc>
+        <w:tc>
+          <w:tcPr>
+            <w:tcW w:type="dxa" w:w="960"/>
+          </w:tcPr>
+          <w:p>
+            <w:r>
+              <w:t>Высокий</w:t>
+            </w:r>
+          </w:p>
+        </w:tc>
+        <w:tc>
+          <w:tcPr>
+            <w:tcW w:type="dxa" w:w="960"/>
+          </w:tcPr>
+          <w:p>
+            <w:r>
+              <w:t>Задача выполнена</w:t>
+            </w:r>
+          </w:p>
+        </w:tc>
+        <w:tc>
+          <w:tcPr>
+            <w:tcW w:type="dxa" w:w="960"/>
+          </w:tcPr>
+          <w:p>
+            <w:r>
+              <w:t>Внести фактические трудозатраты</w:t>
+            </w:r>
+          </w:p>
+        </w:tc>
+        <w:tc>
+          <w:tcPr>
+            <w:tcW w:type="dxa" w:w="960"/>
+          </w:tcPr>
+          <w:p>
+            <w:r>
+              <w:t>Фактические трудозатраты сохранены</w:t>
+            </w:r>
+          </w:p>
+        </w:tc>
+        <w:tc>
+          <w:tcPr>
+            <w:tcW w:type="dxa" w:w="960"/>
+          </w:tcPr>
+          <w:p/>
+        </w:tc>
+        <w:tc>
+          <w:tcPr>
+            <w:tcW w:type="dxa" w:w="960"/>
+          </w:tcPr>
+          <w:p/>
+        </w:tc>
+      </w:tr>
+      <w:tr>
+        <w:tc>
+          <w:tcPr>
+            <w:tcW w:type="dxa" w:w="960"/>
+          </w:tcPr>
+          <w:p>
+            <w:r>
+              <w:t>TC-PK-009</w:t>
+            </w:r>
+          </w:p>
+        </w:tc>
+        <w:tc>
+          <w:tcPr>
+            <w:tcW w:type="dxa" w:w="960"/>
+          </w:tcPr>
+          <w:p>
+            <w:r>
+              <w:t>COV-PK-005</w:t>
+            </w:r>
+          </w:p>
+        </w:tc>
+        <w:tc>
+          <w:tcPr>
+            <w:tcW w:type="dxa" w:w="960"/>
+          </w:tcPr>
+          <w:p>
+            <w:r>
+              <w:t>Создание заявки на закупку</w:t>
+            </w:r>
+          </w:p>
+        </w:tc>
+        <w:tc>
+          <w:tcPr>
+            <w:tcW w:type="dxa" w:w="960"/>
+          </w:tcPr>
+          <w:p>
+            <w:r>
+              <w:t>Средний</w:t>
+            </w:r>
+          </w:p>
+        </w:tc>
+        <w:tc>
+          <w:tcPr>
+            <w:tcW w:type="dxa" w:w="960"/>
+          </w:tcPr>
+          <w:p>
+            <w:r>
+              <w:t>Смета существует</w:t>
+            </w:r>
+          </w:p>
+        </w:tc>
+        <w:tc>
+          <w:tcPr>
+            <w:tcW w:type="dxa" w:w="960"/>
+          </w:tcPr>
+          <w:p>
+            <w:r>
+              <w:t>Создать заявку на основе сметы</w:t>
+            </w:r>
+          </w:p>
+        </w:tc>
+        <w:tc>
+          <w:tcPr>
+            <w:tcW w:type="dxa" w:w="960"/>
+          </w:tcPr>
+          <w:p>
+            <w:r>
+              <w:t>Заявка создана и привязана к проекту</w:t>
+            </w:r>
+          </w:p>
+        </w:tc>
+        <w:tc>
+          <w:tcPr>
+            <w:tcW w:type="dxa" w:w="960"/>
+          </w:tcPr>
+          <w:p/>
+        </w:tc>
+        <w:tc>
+          <w:tcPr>
+            <w:tcW w:type="dxa" w:w="960"/>
+          </w:tcPr>
+          <w:p/>
+        </w:tc>
+      </w:tr>
+      <w:tr>
+        <w:tc>
+          <w:tcPr>
+            <w:tcW w:type="dxa" w:w="960"/>
+          </w:tcPr>
+          <w:p>
+            <w:r>
+              <w:t>TC-PK-010</w:t>
+            </w:r>
+          </w:p>
+        </w:tc>
+        <w:tc>
+          <w:tcPr>
+            <w:tcW w:type="dxa" w:w="960"/>
+          </w:tcPr>
+          <w:p>
+            <w:r>
+              <w:t>COV-PK-005</w:t>
+            </w:r>
+          </w:p>
+        </w:tc>
+        <w:tc>
+          <w:tcPr>
+            <w:tcW w:type="dxa" w:w="960"/>
+          </w:tcPr>
+          <w:p>
+            <w:r>
+              <w:t>Выбор поставщика</w:t>
+            </w:r>
+          </w:p>
+        </w:tc>
+        <w:tc>
+          <w:tcPr>
+            <w:tcW w:type="dxa" w:w="960"/>
+          </w:tcPr>
+          <w:p>
+            <w:r>
+              <w:t>Средний</w:t>
+            </w:r>
+          </w:p>
+        </w:tc>
+        <w:tc>
+          <w:tcPr>
+            <w:tcW w:type="dxa" w:w="960"/>
+          </w:tcPr>
+          <w:p>
+            <w:r>
+              <w:t>Заявка создана</w:t>
+            </w:r>
+          </w:p>
+        </w:tc>
+        <w:tc>
+          <w:tcPr>
+            <w:tcW w:type="dxa" w:w="960"/>
+          </w:tcPr>
+          <w:p>
+            <w:r>
+              <w:t>Выбрать поставщика</w:t>
+            </w:r>
+          </w:p>
+        </w:tc>
+        <w:tc>
+          <w:tcPr>
+            <w:tcW w:type="dxa" w:w="960"/>
+          </w:tcPr>
+          <w:p>
+            <w:r>
+              <w:t>Выбор сохранен</w:t>
+            </w:r>
+          </w:p>
+        </w:tc>
+        <w:tc>
+          <w:tcPr>
+            <w:tcW w:type="dxa" w:w="960"/>
+          </w:tcPr>
+          <w:p/>
+        </w:tc>
+        <w:tc>
+          <w:tcPr>
+            <w:tcW w:type="dxa" w:w="960"/>
+          </w:tcPr>
+          <w:p/>
+        </w:tc>
+      </w:tr>
+      <w:tr>
+        <w:tc>
+          <w:tcPr>
+            <w:tcW w:type="dxa" w:w="960"/>
+          </w:tcPr>
+          <w:p>
+            <w:r>
+              <w:t>TC-PK-011</w:t>
+            </w:r>
+          </w:p>
+        </w:tc>
+        <w:tc>
+          <w:tcPr>
+            <w:tcW w:type="dxa" w:w="960"/>
+          </w:tcPr>
+          <w:p>
+            <w:r>
+              <w:t>COV-PK-006</w:t>
+            </w:r>
+          </w:p>
+        </w:tc>
+        <w:tc>
+          <w:tcPr>
+            <w:tcW w:type="dxa" w:w="960"/>
+          </w:tcPr>
+          <w:p>
+            <w:r>
+              <w:t>Генерация договора</w:t>
+            </w:r>
+          </w:p>
+        </w:tc>
+        <w:tc>
+          <w:tcPr>
+            <w:tcW w:type="dxa" w:w="960"/>
+          </w:tcPr>
+          <w:p>
+            <w:r>
+              <w:t>Средний</w:t>
+            </w:r>
+          </w:p>
+        </w:tc>
+        <w:tc>
+          <w:tcPr>
+            <w:tcW w:type="dxa" w:w="960"/>
+          </w:tcPr>
+          <w:p>
+            <w:r>
+              <w:t>Данные клиента и проекта заполнены</w:t>
+            </w:r>
+          </w:p>
+        </w:tc>
+        <w:tc>
+          <w:tcPr>
+            <w:tcW w:type="dxa" w:w="960"/>
+          </w:tcPr>
+          <w:p>
+            <w:r>
+              <w:t>Сгенерировать договор</w:t>
+            </w:r>
+          </w:p>
+        </w:tc>
+        <w:tc>
+          <w:tcPr>
+            <w:tcW w:type="dxa" w:w="960"/>
+          </w:tcPr>
+          <w:p>
+            <w:r>
+              <w:t>Договор создан на основе данных</w:t>
+            </w:r>
+          </w:p>
+        </w:tc>
+        <w:tc>
+          <w:tcPr>
+            <w:tcW w:type="dxa" w:w="960"/>
+          </w:tcPr>
+          <w:p/>
+        </w:tc>
+        <w:tc>
+          <w:tcPr>
+            <w:tcW w:type="dxa" w:w="960"/>
+          </w:tcPr>
+          <w:p/>
+        </w:tc>
+      </w:tr>
+      <w:tr>
+        <w:tc>
+          <w:tcPr>
+            <w:tcW w:type="dxa" w:w="960"/>
+          </w:tcPr>
+          <w:p>
+            <w:r>
+              <w:t>TC-PK-012</w:t>
+            </w:r>
+          </w:p>
+        </w:tc>
+        <w:tc>
+          <w:tcPr>
+            <w:tcW w:type="dxa" w:w="960"/>
+          </w:tcPr>
+          <w:p>
+            <w:r>
+              <w:t>COV-PK-007</w:t>
+            </w:r>
+          </w:p>
+        </w:tc>
+        <w:tc>
+          <w:tcPr>
+            <w:tcW w:type="dxa" w:w="960"/>
+          </w:tcPr>
+          <w:p>
+            <w:r>
+              <w:t>Завершение проекта</w:t>
+            </w:r>
+          </w:p>
+        </w:tc>
+        <w:tc>
+          <w:tcPr>
+            <w:tcW w:type="dxa" w:w="960"/>
+          </w:tcPr>
+          <w:p>
+            <w:r>
+              <w:t>Высокий</w:t>
+            </w:r>
+          </w:p>
+        </w:tc>
+        <w:tc>
+          <w:tcPr>
+            <w:tcW w:type="dxa" w:w="960"/>
+          </w:tcPr>
+          <w:p>
+            <w:r>
+              <w:t>Проект в состоянии завершения</w:t>
+            </w:r>
+          </w:p>
+        </w:tc>
+        <w:tc>
+          <w:tcPr>
+            <w:tcW w:type="dxa" w:w="960"/>
+          </w:tcPr>
+          <w:p>
+            <w:r>
+              <w:t>Выполнить завершение проекта</w:t>
+            </w:r>
+          </w:p>
+        </w:tc>
+        <w:tc>
+          <w:tcPr>
+            <w:tcW w:type="dxa" w:w="960"/>
+          </w:tcPr>
+          <w:p>
+            <w:r>
+              <w:t>Проект переведен в итоговое состояние</w:t>
+            </w:r>
+          </w:p>
+        </w:tc>
+        <w:tc>
+          <w:tcPr>
+            <w:tcW w:type="dxa" w:w="960"/>
+          </w:tcPr>
+          <w:p/>
+        </w:tc>
+        <w:tc>
+          <w:tcPr>
+            <w:tcW w:type="dxa" w:w="960"/>
+          </w:tcPr>
+          <w:p/>
+        </w:tc>
+      </w:tr>
+      <w:tr>
+        <w:tc>
+          <w:tcPr>
+            <w:tcW w:type="dxa" w:w="960"/>
+          </w:tcPr>
+          <w:p>
+            <w:r>
+              <w:t>TC-PK-013</w:t>
+            </w:r>
+          </w:p>
+        </w:tc>
+        <w:tc>
+          <w:tcPr>
+            <w:tcW w:type="dxa" w:w="960"/>
+          </w:tcPr>
+          <w:p>
+            <w:r>
+              <w:t>COV-PK-008</w:t>
+            </w:r>
+          </w:p>
+        </w:tc>
+        <w:tc>
+          <w:tcPr>
+            <w:tcW w:type="dxa" w:w="960"/>
+          </w:tcPr>
+          <w:p>
+            <w:r>
+              <w:t>Проверка доступа менеджера</w:t>
+            </w:r>
+          </w:p>
+        </w:tc>
+        <w:tc>
+          <w:tcPr>
+            <w:tcW w:type="dxa" w:w="960"/>
+          </w:tcPr>
+          <w:p>
+            <w:r>
+              <w:t>Высокий</w:t>
+            </w:r>
+          </w:p>
+        </w:tc>
+        <w:tc>
+          <w:tcPr>
+            <w:tcW w:type="dxa" w:w="960"/>
+          </w:tcPr>
+          <w:p>
+            <w:r>
+              <w:t>Пользователь с ролью менеджера</w:t>
+            </w:r>
+          </w:p>
+        </w:tc>
+        <w:tc>
+          <w:tcPr>
+            <w:tcW w:type="dxa" w:w="960"/>
+          </w:tcPr>
+          <w:p>
+            <w:r>
+              <w:t>Выполнить доступные действия</w:t>
+            </w:r>
+          </w:p>
+        </w:tc>
+        <w:tc>
+          <w:tcPr>
+            <w:tcW w:type="dxa" w:w="960"/>
+          </w:tcPr>
+          <w:p>
+            <w:r>
+              <w:t>Доступ разрешен в пределах роли</w:t>
+            </w:r>
+          </w:p>
+        </w:tc>
+        <w:tc>
+          <w:tcPr>
+            <w:tcW w:type="dxa" w:w="960"/>
+          </w:tcPr>
+          <w:p/>
+        </w:tc>
+        <w:tc>
+          <w:tcPr>
+            <w:tcW w:type="dxa" w:w="960"/>
+          </w:tcPr>
+          <w:p/>
+        </w:tc>
+      </w:tr>
+      <w:tr>
+        <w:tc>
+          <w:tcPr>
+            <w:tcW w:type="dxa" w:w="960"/>
+          </w:tcPr>
+          <w:p>
+            <w:r>
+              <w:t>TC-PK-014</w:t>
+            </w:r>
+          </w:p>
+        </w:tc>
+        <w:tc>
+          <w:tcPr>
+            <w:tcW w:type="dxa" w:w="960"/>
+          </w:tcPr>
+          <w:p>
+            <w:r>
+              <w:t>COV-PK-008</w:t>
+            </w:r>
+          </w:p>
+        </w:tc>
+        <w:tc>
+          <w:tcPr>
+            <w:tcW w:type="dxa" w:w="960"/>
+          </w:tcPr>
+          <w:p>
+            <w:r>
+              <w:t>Ограничение доступа монтажника</w:t>
+            </w:r>
+          </w:p>
+        </w:tc>
+        <w:tc>
+          <w:tcPr>
+            <w:tcW w:type="dxa" w:w="960"/>
+          </w:tcPr>
+          <w:p>
+            <w:r>
+              <w:t>Высокий</w:t>
+            </w:r>
+          </w:p>
+        </w:tc>
+        <w:tc>
+          <w:tcPr>
+            <w:tcW w:type="dxa" w:w="960"/>
+          </w:tcPr>
+          <w:p>
+            <w:r>
+              <w:t>Пользователь с ролью монтажник</w:t>
+            </w:r>
+          </w:p>
+        </w:tc>
+        <w:tc>
+          <w:tcPr>
+            <w:tcW w:type="dxa" w:w="960"/>
+          </w:tcPr>
+          <w:p>
+            <w:r>
+              <w:t>Попытаться открыть финансовые данные</w:t>
+            </w:r>
+          </w:p>
+        </w:tc>
+        <w:tc>
+          <w:tcPr>
+            <w:tcW w:type="dxa" w:w="960"/>
+          </w:tcPr>
+          <w:p>
+            <w:r>
+              <w:t>Доступ ограничен</w:t>
+            </w:r>
+          </w:p>
+        </w:tc>
+        <w:tc>
+          <w:tcPr>
+            <w:tcW w:type="dxa" w:w="960"/>
+          </w:tcPr>
+          <w:p/>
+        </w:tc>
+        <w:tc>
+          <w:tcPr>
+            <w:tcW w:type="dxa" w:w="960"/>
+          </w:tcPr>
+          <w:p/>
+        </w:tc>
+      </w:tr>
+      <w:tr>
+        <w:tc>
+          <w:tcPr>
+            <w:tcW w:type="dxa" w:w="960"/>
+          </w:tcPr>
+          <w:p>
+            <w:r>
+              <w:t>TC-PK-015</w:t>
+            </w:r>
+          </w:p>
+        </w:tc>
+        <w:tc>
+          <w:tcPr>
+            <w:tcW w:type="dxa" w:w="960"/>
+          </w:tcPr>
+          <w:p>
+            <w:r>
+              <w:t>COV-PK-009</w:t>
+            </w:r>
+          </w:p>
+        </w:tc>
+        <w:tc>
+          <w:tcPr>
+            <w:tcW w:type="dxa" w:w="960"/>
+          </w:tcPr>
+          <w:p>
+            <w:r>
+              <w:t>Просмотр данных клиента в проекте</w:t>
+            </w:r>
+          </w:p>
+        </w:tc>
+        <w:tc>
+          <w:tcPr>
+            <w:tcW w:type="dxa" w:w="960"/>
+          </w:tcPr>
+          <w:p>
+            <w:r>
+              <w:t>Средний</w:t>
+            </w:r>
+          </w:p>
+        </w:tc>
+        <w:tc>
+          <w:tcPr>
+            <w:tcW w:type="dxa" w:w="960"/>
+          </w:tcPr>
+          <w:p>
+            <w:r>
+              <w:t>Проект и клиент существуют</w:t>
+            </w:r>
+          </w:p>
+        </w:tc>
+        <w:tc>
+          <w:tcPr>
+            <w:tcW w:type="dxa" w:w="960"/>
+          </w:tcPr>
+          <w:p>
+            <w:r>
+              <w:t>Открыть проект</w:t>
+            </w:r>
+          </w:p>
+        </w:tc>
+        <w:tc>
+          <w:tcPr>
+            <w:tcW w:type="dxa" w:w="960"/>
+          </w:tcPr>
+          <w:p>
+            <w:r>
+              <w:t>Данные клиента отображаются</w:t>
+            </w:r>
+          </w:p>
+        </w:tc>
+        <w:tc>
+          <w:tcPr>
+            <w:tcW w:type="dxa" w:w="960"/>
+          </w:tcPr>
+          <w:p/>
+        </w:tc>
+        <w:tc>
+          <w:tcPr>
+            <w:tcW w:type="dxa" w:w="960"/>
           </w:tcPr>
           <w:p/>
         </w:tc>
       </w:tr>
     </w:tbl>
+    <w:p>
+      <w:pPr>
+        <w:pStyle w:val="Heading1"/>
+      </w:pPr>
+      <w:r>
+        <w:t>5. Результаты выполнения</w:t>
+      </w:r>
+    </w:p>
+    <w:tbl>
+      <w:tblPr>
+        <w:tblStyle w:val="TableGrid"/>
+        <w:tblW w:type="auto" w:w="0"/>
+        <w:tblLook w:firstColumn="1" w:firstRow="1" w:lastColumn="0" w:lastRow="0" w:noHBand="0" w:noVBand="1" w:val="04A0"/>
+      </w:tblPr>
+      <w:tblGrid>
+        <w:gridCol w:w="4320"/>
+        <w:gridCol w:w="4320"/>
+      </w:tblGrid>
+      <w:tr>
+        <w:tc>
+          <w:tcPr>
+            <w:tcW w:type="dxa" w:w="4320"/>
+            <w:shd w:fill="E0E0E0"/>
+          </w:tcPr>
+          <w:p>
+            <w:r>
+              <w:t>Всего контрольных примеров</w:t>
+            </w:r>
+          </w:p>
+        </w:tc>
+        <w:tc>
+          <w:tcPr>
+            <w:tcW w:type="dxa" w:w="4320"/>
+          </w:tcPr>
+          <w:p>
+            <w:r>
+              <w:t>15</w:t>
+            </w:r>
+          </w:p>
+        </w:tc>
+      </w:tr>
+      <w:tr>
+        <w:tc>
+          <w:tcPr>
+            <w:tcW w:type="dxa" w:w="4320"/>
+            <w:shd w:fill="E0E0E0"/>
+          </w:tcPr>
+          <w:p>
+            <w:r>
+              <w:t>Выполнено</w:t>
+            </w:r>
+          </w:p>
+        </w:tc>
+        <w:tc>
+          <w:tcPr>
+            <w:tcW w:type="dxa" w:w="4320"/>
+          </w:tcPr>
+          <w:p>
+            <w:r/>
+          </w:p>
+        </w:tc>
+      </w:tr>
+      <w:tr>
+        <w:tc>
+          <w:tcPr>
+            <w:tcW w:type="dxa" w:w="4320"/>
+            <w:shd w:fill="E0E0E0"/>
+          </w:tcPr>
+          <w:p>
+            <w:r>
+              <w:t>Успешно выполнено</w:t>
+            </w:r>
+          </w:p>
+        </w:tc>
+        <w:tc>
+          <w:tcPr>
+            <w:tcW w:type="dxa" w:w="4320"/>
+          </w:tcPr>
+          <w:p>
+            <w:r/>
+          </w:p>
+        </w:tc>
+      </w:tr>
+      <w:tr>
+        <w:tc>
+          <w:tcPr>
+            <w:tcW w:type="dxa" w:w="4320"/>
+            <w:shd w:fill="E0E0E0"/>
+          </w:tcPr>
+          <w:p>
+            <w:r>
+              <w:t>Неуспешно выполнено</w:t>
+            </w:r>
+          </w:p>
+        </w:tc>
+        <w:tc>
+          <w:tcPr>
+            <w:tcW w:type="dxa" w:w="4320"/>
+          </w:tcPr>
+          <w:p>
+            <w:r/>
+          </w:p>
+        </w:tc>
+      </w:tr>
+      <w:tr>
+        <w:tc>
+          <w:tcPr>
+            <w:tcW w:type="dxa" w:w="4320"/>
+            <w:shd w:fill="E0E0E0"/>
+          </w:tcPr>
+          <w:p>
+            <w:r>
+              <w:t>Заблокировано</w:t>
+            </w:r>
+          </w:p>
+        </w:tc>
+        <w:tc>
+          <w:tcPr>
+            <w:tcW w:type="dxa" w:w="4320"/>
+          </w:tcPr>
+          <w:p>
+            <w:r/>
+          </w:p>
+        </w:tc>
+      </w:tr>
+      <w:tr>
+        <w:tc>
+          <w:tcPr>
+            <w:tcW w:type="dxa" w:w="4320"/>
+            <w:shd w:fill="E0E0E0"/>
+          </w:tcPr>
+          <w:p>
+            <w:r>
+              <w:t>Не применимо</w:t>
+            </w:r>
+          </w:p>
+        </w:tc>
+        <w:tc>
+          <w:tcPr>
+            <w:tcW w:type="dxa" w:w="4320"/>
+          </w:tcPr>
+          <w:p>
+            <w:r/>
+          </w:p>
+        </w:tc>
+      </w:tr>
+      <w:tr>
+        <w:tc>
+          <w:tcPr>
+            <w:tcW w:type="dxa" w:w="4320"/>
+          </w:tcPr>
+          <w:p/>
+        </w:tc>
+        <w:tc>
+          <w:tcPr>
+            <w:tcW w:type="dxa" w:w="4320"/>
+          </w:tcPr>
+          <w:p/>
+        </w:tc>
+      </w:tr>
+    </w:tbl>
+    <w:p/>
+    <w:p>
+      <w:r>
+        <w:t>Итоговое заключение: ____________________________________________________________</w:t>
+      </w:r>
+    </w:p>
+    <w:p/>
+    <w:p>
+      <w:r>
+        <w:t>Подпись исполнителя: __________</w:t>
+      </w:r>
+    </w:p>
+    <w:p>
+      <w:r>
+        <w:t>Дата: 18.04.2026</w:t>
+      </w:r>
+    </w:p>
     <w:sectPr>
       <w:pgSz w:w="12240" w:h="15840"/>
       <w:pgMar w:top="1440" w:right="1800" w:bottom="1440" w:left="1800" w:header="720" w:footer="720" w:gutter="0"/>
@@ -2273,6 +2892,10 @@
     <w:name w:val="Normal"/>
     <w:qFormat/>
     <w:rsid w:val="00FC693F"/>
+    <w:rPr>
+      <w:rFonts w:ascii="Times New Roman" w:hAnsi="Times New Roman"/>
+      <w:sz w:val="24"/>
+    </w:rPr>
   </w:style>
   <w:style w:type="paragraph" w:styleId="Header">
     <w:name w:val="header"/>

</xml_diff>

<commit_message>
docs: extend testing checklist with 10 additional test cases
- add status tracking, reminders, file attachments
- add supplier re-evaluation, material receiving
- add overtime analysis, KPI motivation
- add employee effectiveness
- total test cases: 25
</commit_message>
<xml_diff>
--- a/taks/lw_03/check_list_testing.docx
+++ b/taks/lw_03/check_list_testing.docx
@@ -2340,6 +2340,886 @@
           <w:p/>
         </w:tc>
       </w:tr>
+      <w:tr>
+        <w:tc>
+          <w:tcPr>
+            <w:tcW w:type="dxa" w:w="960"/>
+          </w:tcPr>
+          <w:p>
+            <w:r>
+              <w:t>TC-PK-016</w:t>
+            </w:r>
+          </w:p>
+        </w:tc>
+        <w:tc>
+          <w:tcPr>
+            <w:tcW w:type="dxa" w:w="960"/>
+          </w:tcPr>
+          <w:p>
+            <w:r>
+              <w:t>COV-PK-001</w:t>
+            </w:r>
+          </w:p>
+        </w:tc>
+        <w:tc>
+          <w:tcPr>
+            <w:tcW w:type="dxa" w:w="960"/>
+          </w:tcPr>
+          <w:p>
+            <w:r>
+              <w:t>Учет статуса сделки</w:t>
+            </w:r>
+          </w:p>
+        </w:tc>
+        <w:tc>
+          <w:tcPr>
+            <w:tcW w:type="dxa" w:w="960"/>
+          </w:tcPr>
+          <w:p>
+            <w:r>
+              <w:t>Высокий</w:t>
+            </w:r>
+          </w:p>
+        </w:tc>
+        <w:tc>
+          <w:tcPr>
+            <w:tcW w:type="dxa" w:w="960"/>
+          </w:tcPr>
+          <w:p>
+            <w:r>
+              <w:t>Обращение создано</w:t>
+            </w:r>
+          </w:p>
+        </w:tc>
+        <w:tc>
+          <w:tcPr>
+            <w:tcW w:type="dxa" w:w="960"/>
+          </w:tcPr>
+          <w:p>
+            <w:r>
+              <w:t>Изменить статус</w:t>
+            </w:r>
+          </w:p>
+        </w:tc>
+        <w:tc>
+          <w:tcPr>
+            <w:tcW w:type="dxa" w:w="960"/>
+          </w:tcPr>
+          <w:p>
+            <w:r>
+              <w:t>Статус изменен</w:t>
+            </w:r>
+          </w:p>
+        </w:tc>
+        <w:tc>
+          <w:tcPr>
+            <w:tcW w:type="dxa" w:w="960"/>
+          </w:tcPr>
+          <w:p>
+            <w:r/>
+          </w:p>
+        </w:tc>
+        <w:tc>
+          <w:tcPr>
+            <w:tcW w:type="dxa" w:w="960"/>
+          </w:tcPr>
+          <w:p>
+            <w:r/>
+          </w:p>
+        </w:tc>
+      </w:tr>
+      <w:tr>
+        <w:tc>
+          <w:tcPr>
+            <w:tcW w:type="dxa" w:w="960"/>
+          </w:tcPr>
+          <w:p>
+            <w:r>
+              <w:t>TC-PK-017</w:t>
+            </w:r>
+          </w:p>
+        </w:tc>
+        <w:tc>
+          <w:tcPr>
+            <w:tcW w:type="dxa" w:w="960"/>
+          </w:tcPr>
+          <w:p>
+            <w:r>
+              <w:t>COV-PK-001</w:t>
+            </w:r>
+          </w:p>
+        </w:tc>
+        <w:tc>
+          <w:tcPr>
+            <w:tcW w:type="dxa" w:w="960"/>
+          </w:tcPr>
+          <w:p>
+            <w:r>
+              <w:t>Напоминания о встречах</w:t>
+            </w:r>
+          </w:p>
+        </w:tc>
+        <w:tc>
+          <w:tcPr>
+            <w:tcW w:type="dxa" w:w="960"/>
+          </w:tcPr>
+          <w:p>
+            <w:r>
+              <w:t>Средний</w:t>
+            </w:r>
+          </w:p>
+        </w:tc>
+        <w:tc>
+          <w:tcPr>
+            <w:tcW w:type="dxa" w:w="960"/>
+          </w:tcPr>
+          <w:p>
+            <w:r>
+              <w:t>Встреча запланирована</w:t>
+            </w:r>
+          </w:p>
+        </w:tc>
+        <w:tc>
+          <w:tcPr>
+            <w:tcW w:type="dxa" w:w="960"/>
+          </w:tcPr>
+          <w:p>
+            <w:r>
+              <w:t>Проверить</w:t>
+            </w:r>
+          </w:p>
+        </w:tc>
+        <w:tc>
+          <w:tcPr>
+            <w:tcW w:type="dxa" w:w="960"/>
+          </w:tcPr>
+          <w:p>
+            <w:r>
+              <w:t>Напоминание</w:t>
+            </w:r>
+          </w:p>
+        </w:tc>
+        <w:tc>
+          <w:tcPr>
+            <w:tcW w:type="dxa" w:w="960"/>
+          </w:tcPr>
+          <w:p>
+            <w:r/>
+          </w:p>
+        </w:tc>
+        <w:tc>
+          <w:tcPr>
+            <w:tcW w:type="dxa" w:w="960"/>
+          </w:tcPr>
+          <w:p>
+            <w:r/>
+          </w:p>
+        </w:tc>
+      </w:tr>
+      <w:tr>
+        <w:tc>
+          <w:tcPr>
+            <w:tcW w:type="dxa" w:w="960"/>
+          </w:tcPr>
+          <w:p>
+            <w:r>
+              <w:t>TC-PK-018</w:t>
+            </w:r>
+          </w:p>
+        </w:tc>
+        <w:tc>
+          <w:tcPr>
+            <w:tcW w:type="dxa" w:w="960"/>
+          </w:tcPr>
+          <w:p>
+            <w:r>
+              <w:t>COV-PK-002</w:t>
+            </w:r>
+          </w:p>
+        </w:tc>
+        <w:tc>
+          <w:tcPr>
+            <w:tcW w:type="dxa" w:w="960"/>
+          </w:tcPr>
+          <w:p>
+            <w:r>
+              <w:t>Прикрепление файлов</w:t>
+            </w:r>
+          </w:p>
+        </w:tc>
+        <w:tc>
+          <w:tcPr>
+            <w:tcW w:type="dxa" w:w="960"/>
+          </w:tcPr>
+          <w:p>
+            <w:r>
+              <w:t>Высокий</w:t>
+            </w:r>
+          </w:p>
+        </w:tc>
+        <w:tc>
+          <w:tcPr>
+            <w:tcW w:type="dxa" w:w="960"/>
+          </w:tcPr>
+          <w:p>
+            <w:r>
+              <w:t>Проект существует</w:t>
+            </w:r>
+          </w:p>
+        </w:tc>
+        <w:tc>
+          <w:tcPr>
+            <w:tcW w:type="dxa" w:w="960"/>
+          </w:tcPr>
+          <w:p>
+            <w:r>
+              <w:t>Прикрепить</w:t>
+            </w:r>
+          </w:p>
+        </w:tc>
+        <w:tc>
+          <w:tcPr>
+            <w:tcW w:type="dxa" w:w="960"/>
+          </w:tcPr>
+          <w:p>
+            <w:r>
+              <w:t>Файлы доступны</w:t>
+            </w:r>
+          </w:p>
+        </w:tc>
+        <w:tc>
+          <w:tcPr>
+            <w:tcW w:type="dxa" w:w="960"/>
+          </w:tcPr>
+          <w:p>
+            <w:r/>
+          </w:p>
+        </w:tc>
+        <w:tc>
+          <w:tcPr>
+            <w:tcW w:type="dxa" w:w="960"/>
+          </w:tcPr>
+          <w:p>
+            <w:r/>
+          </w:p>
+        </w:tc>
+      </w:tr>
+      <w:tr>
+        <w:tc>
+          <w:tcPr>
+            <w:tcW w:type="dxa" w:w="960"/>
+          </w:tcPr>
+          <w:p>
+            <w:r>
+              <w:t>TC-PK-019</w:t>
+            </w:r>
+          </w:p>
+        </w:tc>
+        <w:tc>
+          <w:tcPr>
+            <w:tcW w:type="dxa" w:w="960"/>
+          </w:tcPr>
+          <w:p>
+            <w:r>
+              <w:t>COV-PK-003</w:t>
+            </w:r>
+          </w:p>
+        </w:tc>
+        <w:tc>
+          <w:tcPr>
+            <w:tcW w:type="dxa" w:w="960"/>
+          </w:tcPr>
+          <w:p>
+            <w:r>
+              <w:t>Контроль выполнения задач</w:t>
+            </w:r>
+          </w:p>
+        </w:tc>
+        <w:tc>
+          <w:tcPr>
+            <w:tcW w:type="dxa" w:w="960"/>
+          </w:tcPr>
+          <w:p>
+            <w:r>
+              <w:t>Средний</w:t>
+            </w:r>
+          </w:p>
+        </w:tc>
+        <w:tc>
+          <w:tcPr>
+            <w:tcW w:type="dxa" w:w="960"/>
+          </w:tcPr>
+          <w:p>
+            <w:r>
+              <w:t>Задачи существуют</w:t>
+            </w:r>
+          </w:p>
+        </w:tc>
+        <w:tc>
+          <w:tcPr>
+            <w:tcW w:type="dxa" w:w="960"/>
+          </w:tcPr>
+          <w:p>
+            <w:r>
+              <w:t>Проверить</w:t>
+            </w:r>
+          </w:p>
+        </w:tc>
+        <w:tc>
+          <w:tcPr>
+            <w:tcW w:type="dxa" w:w="960"/>
+          </w:tcPr>
+          <w:p>
+            <w:r>
+              <w:t>Контроль</w:t>
+            </w:r>
+          </w:p>
+        </w:tc>
+        <w:tc>
+          <w:tcPr>
+            <w:tcW w:type="dxa" w:w="960"/>
+          </w:tcPr>
+          <w:p>
+            <w:r/>
+          </w:p>
+        </w:tc>
+        <w:tc>
+          <w:tcPr>
+            <w:tcW w:type="dxa" w:w="960"/>
+          </w:tcPr>
+          <w:p>
+            <w:r/>
+          </w:p>
+        </w:tc>
+      </w:tr>
+      <w:tr>
+        <w:tc>
+          <w:tcPr>
+            <w:tcW w:type="dxa" w:w="960"/>
+          </w:tcPr>
+          <w:p>
+            <w:r>
+              <w:t>TC-PK-020</w:t>
+            </w:r>
+          </w:p>
+        </w:tc>
+        <w:tc>
+          <w:tcPr>
+            <w:tcW w:type="dxa" w:w="960"/>
+          </w:tcPr>
+          <w:p>
+            <w:r>
+              <w:t>COV-PK-005</w:t>
+            </w:r>
+          </w:p>
+        </w:tc>
+        <w:tc>
+          <w:tcPr>
+            <w:tcW w:type="dxa" w:w="960"/>
+          </w:tcPr>
+          <w:p>
+            <w:r>
+              <w:t>Переоценка поставщиков</w:t>
+            </w:r>
+          </w:p>
+        </w:tc>
+        <w:tc>
+          <w:tcPr>
+            <w:tcW w:type="dxa" w:w="960"/>
+          </w:tcPr>
+          <w:p>
+            <w:r>
+              <w:t>Средний</w:t>
+            </w:r>
+          </w:p>
+        </w:tc>
+        <w:tc>
+          <w:tcPr>
+            <w:tcW w:type="dxa" w:w="960"/>
+          </w:tcPr>
+          <w:p>
+            <w:r>
+              <w:t>Закупка создана</w:t>
+            </w:r>
+          </w:p>
+        </w:tc>
+        <w:tc>
+          <w:tcPr>
+            <w:tcW w:type="dxa" w:w="960"/>
+          </w:tcPr>
+          <w:p>
+            <w:r>
+              <w:t>Проверить</w:t>
+            </w:r>
+          </w:p>
+        </w:tc>
+        <w:tc>
+          <w:tcPr>
+            <w:tcW w:type="dxa" w:w="960"/>
+          </w:tcPr>
+          <w:p>
+            <w:r>
+              <w:t>Предложения</w:t>
+            </w:r>
+          </w:p>
+        </w:tc>
+        <w:tc>
+          <w:tcPr>
+            <w:tcW w:type="dxa" w:w="960"/>
+          </w:tcPr>
+          <w:p>
+            <w:r/>
+          </w:p>
+        </w:tc>
+        <w:tc>
+          <w:tcPr>
+            <w:tcW w:type="dxa" w:w="960"/>
+          </w:tcPr>
+          <w:p>
+            <w:r/>
+          </w:p>
+        </w:tc>
+      </w:tr>
+      <w:tr>
+        <w:tc>
+          <w:tcPr>
+            <w:tcW w:type="dxa" w:w="960"/>
+          </w:tcPr>
+          <w:p>
+            <w:r>
+              <w:t>TC-PK-021</w:t>
+            </w:r>
+          </w:p>
+        </w:tc>
+        <w:tc>
+          <w:tcPr>
+            <w:tcW w:type="dxa" w:w="960"/>
+          </w:tcPr>
+          <w:p>
+            <w:r>
+              <w:t>COV-PK-005</w:t>
+            </w:r>
+          </w:p>
+        </w:tc>
+        <w:tc>
+          <w:tcPr>
+            <w:tcW w:type="dxa" w:w="960"/>
+          </w:tcPr>
+          <w:p>
+            <w:r>
+              <w:t>Поступление материалов</w:t>
+            </w:r>
+          </w:p>
+        </w:tc>
+        <w:tc>
+          <w:tcPr>
+            <w:tcW w:type="dxa" w:w="960"/>
+          </w:tcPr>
+          <w:p>
+            <w:r>
+              <w:t>Средний</w:t>
+            </w:r>
+          </w:p>
+        </w:tc>
+        <w:tc>
+          <w:tcPr>
+            <w:tcW w:type="dxa" w:w="960"/>
+          </w:tcPr>
+          <w:p>
+            <w:r>
+              <w:t>Закупка оплачена</w:t>
+            </w:r>
+          </w:p>
+        </w:tc>
+        <w:tc>
+          <w:tcPr>
+            <w:tcW w:type="dxa" w:w="960"/>
+          </w:tcPr>
+          <w:p>
+            <w:r>
+              <w:t>Зафиксировать</w:t>
+            </w:r>
+          </w:p>
+        </w:tc>
+        <w:tc>
+          <w:tcPr>
+            <w:tcW w:type="dxa" w:w="960"/>
+          </w:tcPr>
+          <w:p>
+            <w:r>
+              <w:t>Учтено</w:t>
+            </w:r>
+          </w:p>
+        </w:tc>
+        <w:tc>
+          <w:tcPr>
+            <w:tcW w:type="dxa" w:w="960"/>
+          </w:tcPr>
+          <w:p>
+            <w:r/>
+          </w:p>
+        </w:tc>
+        <w:tc>
+          <w:tcPr>
+            <w:tcW w:type="dxa" w:w="960"/>
+          </w:tcPr>
+          <w:p>
+            <w:r/>
+          </w:p>
+        </w:tc>
+      </w:tr>
+      <w:tr>
+        <w:tc>
+          <w:tcPr>
+            <w:tcW w:type="dxa" w:w="960"/>
+          </w:tcPr>
+          <w:p>
+            <w:r>
+              <w:t>TC-PK-022</w:t>
+            </w:r>
+          </w:p>
+        </w:tc>
+        <w:tc>
+          <w:tcPr>
+            <w:tcW w:type="dxa" w:w="960"/>
+          </w:tcPr>
+          <w:p>
+            <w:r>
+              <w:t>COV-PK-004</w:t>
+            </w:r>
+          </w:p>
+        </w:tc>
+        <w:tc>
+          <w:tcPr>
+            <w:tcW w:type="dxa" w:w="960"/>
+          </w:tcPr>
+          <w:p>
+            <w:r>
+              <w:t>Анализ переработок</w:t>
+            </w:r>
+          </w:p>
+        </w:tc>
+        <w:tc>
+          <w:tcPr>
+            <w:tcW w:type="dxa" w:w="960"/>
+          </w:tcPr>
+          <w:p>
+            <w:r>
+              <w:t>Высокий</w:t>
+            </w:r>
+          </w:p>
+        </w:tc>
+        <w:tc>
+          <w:tcPr>
+            <w:tcW w:type="dxa" w:w="960"/>
+          </w:tcPr>
+          <w:p>
+            <w:r>
+              <w:t>Данные внесены</w:t>
+            </w:r>
+          </w:p>
+        </w:tc>
+        <w:tc>
+          <w:tcPr>
+            <w:tcW w:type="dxa" w:w="960"/>
+          </w:tcPr>
+          <w:p>
+            <w:r>
+              <w:t>Отчет</w:t>
+            </w:r>
+          </w:p>
+        </w:tc>
+        <w:tc>
+          <w:tcPr>
+            <w:tcW w:type="dxa" w:w="960"/>
+          </w:tcPr>
+          <w:p>
+            <w:r>
+              <w:t>Переработки</w:t>
+            </w:r>
+          </w:p>
+        </w:tc>
+        <w:tc>
+          <w:tcPr>
+            <w:tcW w:type="dxa" w:w="960"/>
+          </w:tcPr>
+          <w:p>
+            <w:r/>
+          </w:p>
+        </w:tc>
+        <w:tc>
+          <w:tcPr>
+            <w:tcW w:type="dxa" w:w="960"/>
+          </w:tcPr>
+          <w:p>
+            <w:r/>
+          </w:p>
+        </w:tc>
+      </w:tr>
+      <w:tr>
+        <w:tc>
+          <w:tcPr>
+            <w:tcW w:type="dxa" w:w="960"/>
+          </w:tcPr>
+          <w:p>
+            <w:r>
+              <w:t>TC-PK-023</w:t>
+            </w:r>
+          </w:p>
+        </w:tc>
+        <w:tc>
+          <w:tcPr>
+            <w:tcW w:type="dxa" w:w="960"/>
+          </w:tcPr>
+          <w:p>
+            <w:r>
+              <w:t>COV-PK-004</w:t>
+            </w:r>
+          </w:p>
+        </w:tc>
+        <w:tc>
+          <w:tcPr>
+            <w:tcW w:type="dxa" w:w="960"/>
+          </w:tcPr>
+          <w:p>
+            <w:r>
+              <w:t>Мотивация по KPI</w:t>
+            </w:r>
+          </w:p>
+        </w:tc>
+        <w:tc>
+          <w:tcPr>
+            <w:tcW w:type="dxa" w:w="960"/>
+          </w:tcPr>
+          <w:p>
+            <w:r>
+              <w:t>Высокий</w:t>
+            </w:r>
+          </w:p>
+        </w:tc>
+        <w:tc>
+          <w:tcPr>
+            <w:tcW w:type="dxa" w:w="960"/>
+          </w:tcPr>
+          <w:p>
+            <w:r>
+              <w:t>Задачи выполнены</w:t>
+            </w:r>
+          </w:p>
+        </w:tc>
+        <w:tc>
+          <w:tcPr>
+            <w:tcW w:type="dxa" w:w="960"/>
+          </w:tcPr>
+          <w:p>
+            <w:r>
+              <w:t>Рассчитать</w:t>
+            </w:r>
+          </w:p>
+        </w:tc>
+        <w:tc>
+          <w:tcPr>
+            <w:tcW w:type="dxa" w:w="960"/>
+          </w:tcPr>
+          <w:p>
+            <w:r>
+              <w:t>Рассчитано</w:t>
+            </w:r>
+          </w:p>
+        </w:tc>
+        <w:tc>
+          <w:tcPr>
+            <w:tcW w:type="dxa" w:w="960"/>
+          </w:tcPr>
+          <w:p>
+            <w:r/>
+          </w:p>
+        </w:tc>
+        <w:tc>
+          <w:tcPr>
+            <w:tcW w:type="dxa" w:w="960"/>
+          </w:tcPr>
+          <w:p>
+            <w:r/>
+          </w:p>
+        </w:tc>
+      </w:tr>
+      <w:tr>
+        <w:tc>
+          <w:tcPr>
+            <w:tcW w:type="dxa" w:w="960"/>
+          </w:tcPr>
+          <w:p>
+            <w:r>
+              <w:t>TC-PK-024</w:t>
+            </w:r>
+          </w:p>
+        </w:tc>
+        <w:tc>
+          <w:tcPr>
+            <w:tcW w:type="dxa" w:w="960"/>
+          </w:tcPr>
+          <w:p>
+            <w:r>
+              <w:t>COV-PK-004</w:t>
+            </w:r>
+          </w:p>
+        </w:tc>
+        <w:tc>
+          <w:tcPr>
+            <w:tcW w:type="dxa" w:w="960"/>
+          </w:tcPr>
+          <w:p>
+            <w:r>
+              <w:t>Эффективность сотрудников</w:t>
+            </w:r>
+          </w:p>
+        </w:tc>
+        <w:tc>
+          <w:tcPr>
+            <w:tcW w:type="dxa" w:w="960"/>
+          </w:tcPr>
+          <w:p>
+            <w:r>
+              <w:t>Средний</w:t>
+            </w:r>
+          </w:p>
+        </w:tc>
+        <w:tc>
+          <w:tcPr>
+            <w:tcW w:type="dxa" w:w="960"/>
+          </w:tcPr>
+          <w:p>
+            <w:r>
+              <w:t>Данные накоплены</w:t>
+            </w:r>
+          </w:p>
+        </w:tc>
+        <w:tc>
+          <w:tcPr>
+            <w:tcW w:type="dxa" w:w="960"/>
+          </w:tcPr>
+          <w:p>
+            <w:r>
+              <w:t>Анализ</w:t>
+            </w:r>
+          </w:p>
+        </w:tc>
+        <w:tc>
+          <w:tcPr>
+            <w:tcW w:type="dxa" w:w="960"/>
+          </w:tcPr>
+          <w:p>
+            <w:r>
+              <w:t>Показатели</w:t>
+            </w:r>
+          </w:p>
+        </w:tc>
+        <w:tc>
+          <w:tcPr>
+            <w:tcW w:type="dxa" w:w="960"/>
+          </w:tcPr>
+          <w:p>
+            <w:r/>
+          </w:p>
+        </w:tc>
+        <w:tc>
+          <w:tcPr>
+            <w:tcW w:type="dxa" w:w="960"/>
+          </w:tcPr>
+          <w:p>
+            <w:r/>
+          </w:p>
+        </w:tc>
+      </w:tr>
+      <w:tr>
+        <w:tc>
+          <w:tcPr>
+            <w:tcW w:type="dxa" w:w="960"/>
+          </w:tcPr>
+          <w:p>
+            <w:r>
+              <w:t>TC-PK-025</w:t>
+            </w:r>
+          </w:p>
+        </w:tc>
+        <w:tc>
+          <w:tcPr>
+            <w:tcW w:type="dxa" w:w="960"/>
+          </w:tcPr>
+          <w:p>
+            <w:r>
+              <w:t>COV-PK-002</w:t>
+            </w:r>
+          </w:p>
+        </w:tc>
+        <w:tc>
+          <w:tcPr>
+            <w:tcW w:type="dxa" w:w="960"/>
+          </w:tcPr>
+          <w:p>
+            <w:r>
+              <w:t>Реестр договоров</w:t>
+            </w:r>
+          </w:p>
+        </w:tc>
+        <w:tc>
+          <w:tcPr>
+            <w:tcW w:type="dxa" w:w="960"/>
+          </w:tcPr>
+          <w:p>
+            <w:r>
+              <w:t>Высокий</w:t>
+            </w:r>
+          </w:p>
+        </w:tc>
+        <w:tc>
+          <w:tcPr>
+            <w:tcW w:type="dxa" w:w="960"/>
+          </w:tcPr>
+          <w:p>
+            <w:r>
+              <w:t>Проект существует</w:t>
+            </w:r>
+          </w:p>
+        </w:tc>
+        <w:tc>
+          <w:tcPr>
+            <w:tcW w:type="dxa" w:w="960"/>
+          </w:tcPr>
+          <w:p>
+            <w:r>
+              <w:t>Добавить</w:t>
+            </w:r>
+          </w:p>
+        </w:tc>
+        <w:tc>
+          <w:tcPr>
+            <w:tcW w:type="dxa" w:w="960"/>
+          </w:tcPr>
+          <w:p>
+            <w:r>
+              <w:t>В реестре</w:t>
+            </w:r>
+          </w:p>
+        </w:tc>
+        <w:tc>
+          <w:tcPr>
+            <w:tcW w:type="dxa" w:w="960"/>
+          </w:tcPr>
+          <w:p>
+            <w:r/>
+          </w:p>
+        </w:tc>
+        <w:tc>
+          <w:tcPr>
+            <w:tcW w:type="dxa" w:w="960"/>
+          </w:tcPr>
+          <w:p>
+            <w:r/>
+          </w:p>
+        </w:tc>
+      </w:tr>
     </w:tbl>
     <w:p>
       <w:pPr>
@@ -2377,7 +3257,7 @@
           </w:tcPr>
           <w:p>
             <w:r>
-              <w:t>15</w:t>
+              <w:t>25</w:t>
             </w:r>
           </w:p>
         </w:tc>

</xml_diff>